<commit_message>
feat: align generated MDRK with manual form
</commit_message>
<xml_diff>
--- a/src/mdrk_builder/resources/canonical_mdrk_template.docx
+++ b/src/mdrk_builder/resources/canonical_mdrk_template.docx
@@ -401,7 +401,7 @@
       <w:rFonts w:ascii="Times New Roman" w:hAnsi="Times New Roman" w:eastAsia="Times New Roman" w:cs="Times New Roman"/>
       <w:b w:val="0"/>
       <w:color w:val="000000"/>
-      <w:sz w:val="20"/>
+      <w:sz w:val="24"/>
     </w:rPr>
   </w:style>
   <w:style w:type="paragraph" w:styleId="Header">
@@ -12099,7 +12099,7 @@
       <w:rFonts w:ascii="Times New Roman" w:hAnsi="Times New Roman" w:eastAsia="Times New Roman" w:cs="Times New Roman"/>
       <w:b w:val="0"/>
       <w:color w:val="000000"/>
-      <w:sz w:val="20"/>
+      <w:sz w:val="24"/>
     </w:rPr>
   </w:style>
   <w:style w:type="paragraph" w:customStyle="1" w:styleId="MDRKTitle">
@@ -12110,6 +12110,54 @@
       <w:widowControl/>
       <w:spacing w:before="0" w:after="0" w:line="240" w:lineRule="auto"/>
       <w:jc w:val="center"/>
+    </w:pPr>
+    <w:rPr>
+      <w:rFonts w:ascii="Times New Roman" w:hAnsi="Times New Roman" w:eastAsia="Times New Roman" w:cs="Times New Roman"/>
+      <w:b w:val="0"/>
+      <w:color w:val="000000"/>
+      <w:sz w:val="24"/>
+    </w:rPr>
+  </w:style>
+  <w:style w:type="paragraph" w:customStyle="1" w:styleId="MDRKMeeting">
+    <w:name w:val="MDRK Meeting"/>
+    <w:basedOn w:val="MDRKBody"/>
+    <w:pPr>
+      <w:keepNext/>
+      <w:widowControl/>
+      <w:spacing w:before="0" w:after="0" w:line="240" w:lineRule="auto"/>
+      <w:jc w:val="center"/>
+    </w:pPr>
+    <w:rPr>
+      <w:rFonts w:ascii="Times New Roman" w:hAnsi="Times New Roman" w:eastAsia="Times New Roman" w:cs="Times New Roman"/>
+      <w:b w:val="0"/>
+      <w:color w:val="000000"/>
+      <w:sz w:val="24"/>
+    </w:rPr>
+  </w:style>
+  <w:style w:type="paragraph" w:customStyle="1" w:styleId="MDRKSection">
+    <w:name w:val="MDRK Section"/>
+    <w:basedOn w:val="MDRKBody"/>
+    <w:pPr>
+      <w:keepNext/>
+      <w:widowControl/>
+      <w:spacing w:before="60" w:after="0" w:line="240" w:lineRule="auto"/>
+      <w:jc w:val="left"/>
+    </w:pPr>
+    <w:rPr>
+      <w:rFonts w:ascii="Times New Roman" w:hAnsi="Times New Roman" w:eastAsia="Times New Roman" w:cs="Times New Roman"/>
+      <w:b w:val="0"/>
+      <w:color w:val="000000"/>
+      <w:sz w:val="24"/>
+    </w:rPr>
+  </w:style>
+  <w:style w:type="paragraph" w:customStyle="1" w:styleId="MDRKTable">
+    <w:name w:val="MDRK Table"/>
+    <w:basedOn w:val="MDRKBody"/>
+    <w:pPr>
+      <w:keepNext w:val="0"/>
+      <w:widowControl/>
+      <w:spacing w:before="0" w:after="0" w:line="240" w:lineRule="auto"/>
+      <w:jc w:val="left"/>
     </w:pPr>
     <w:rPr>
       <w:rFonts w:ascii="Times New Roman" w:hAnsi="Times New Roman" w:eastAsia="Times New Roman" w:cs="Times New Roman"/>
@@ -12118,11 +12166,27 @@
       <w:sz w:val="20"/>
     </w:rPr>
   </w:style>
-  <w:style w:type="paragraph" w:customStyle="1" w:styleId="MDRKMeeting">
-    <w:name w:val="MDRK Meeting"/>
-    <w:basedOn w:val="MDRKBody"/>
+  <w:style w:type="paragraph" w:customStyle="1" w:styleId="MDRKTableHeader">
+    <w:name w:val="MDRK Table Header"/>
+    <w:basedOn w:val="MDRKTable"/>
     <w:pPr>
       <w:keepNext/>
+      <w:widowControl/>
+      <w:spacing w:before="0" w:after="0" w:line="240" w:lineRule="auto"/>
+      <w:jc w:val="center"/>
+    </w:pPr>
+    <w:rPr>
+      <w:rFonts w:ascii="Times New Roman" w:hAnsi="Times New Roman" w:eastAsia="Times New Roman" w:cs="Times New Roman"/>
+      <w:b/>
+      <w:color w:val="000000"/>
+      <w:sz w:val="20"/>
+    </w:rPr>
+  </w:style>
+  <w:style w:type="paragraph" w:customStyle="1" w:styleId="MDRKMCFCode">
+    <w:name w:val="MDRK MCF Code"/>
+    <w:basedOn w:val="MDRKTable"/>
+    <w:pPr>
+      <w:keepNext w:val="0"/>
       <w:widowControl/>
       <w:spacing w:before="0" w:after="0" w:line="240" w:lineRule="auto"/>
       <w:jc w:val="center"/>
@@ -12134,24 +12198,24 @@
       <w:sz w:val="20"/>
     </w:rPr>
   </w:style>
-  <w:style w:type="paragraph" w:customStyle="1" w:styleId="MDRKSection">
-    <w:name w:val="MDRK Section"/>
-    <w:basedOn w:val="MDRKBody"/>
-    <w:pPr>
-      <w:keepNext/>
+  <w:style w:type="paragraph" w:customStyle="1" w:styleId="MDRKTask">
+    <w:name w:val="MDRK Task"/>
+    <w:basedOn w:val="ListNumber"/>
+    <w:pPr>
+      <w:keepNext w:val="0"/>
       <w:widowControl/>
-      <w:spacing w:before="60" w:after="0" w:line="240" w:lineRule="auto"/>
+      <w:spacing w:before="0" w:after="0" w:line="240" w:lineRule="auto"/>
       <w:jc w:val="left"/>
     </w:pPr>
     <w:rPr>
       <w:rFonts w:ascii="Times New Roman" w:hAnsi="Times New Roman" w:eastAsia="Times New Roman" w:cs="Times New Roman"/>
       <w:b w:val="0"/>
       <w:color w:val="000000"/>
-      <w:sz w:val="20"/>
+      <w:sz w:val="24"/>
     </w:rPr>
   </w:style>
-  <w:style w:type="paragraph" w:customStyle="1" w:styleId="MDRKTable">
-    <w:name w:val="MDRK Table"/>
+  <w:style w:type="paragraph" w:customStyle="1" w:styleId="MDRKWarning">
+    <w:name w:val="MDRK Warning"/>
     <w:basedOn w:val="MDRKBody"/>
     <w:pPr>
       <w:keepNext w:val="0"/>
@@ -12161,73 +12225,9 @@
     </w:pPr>
     <w:rPr>
       <w:rFonts w:ascii="Times New Roman" w:hAnsi="Times New Roman" w:eastAsia="Times New Roman" w:cs="Times New Roman"/>
-      <w:b w:val="0"/>
-      <w:color w:val="000000"/>
-      <w:sz w:val="20"/>
-    </w:rPr>
-  </w:style>
-  <w:style w:type="paragraph" w:customStyle="1" w:styleId="MDRKTableHeader">
-    <w:name w:val="MDRK Table Header"/>
-    <w:basedOn w:val="MDRKTable"/>
-    <w:pPr>
-      <w:keepNext/>
-      <w:widowControl/>
-      <w:spacing w:before="0" w:after="0" w:line="240" w:lineRule="auto"/>
-      <w:jc w:val="center"/>
-    </w:pPr>
-    <w:rPr>
-      <w:rFonts w:ascii="Times New Roman" w:hAnsi="Times New Roman" w:eastAsia="Times New Roman" w:cs="Times New Roman"/>
       <w:b/>
       <w:color w:val="000000"/>
-      <w:sz w:val="20"/>
-    </w:rPr>
-  </w:style>
-  <w:style w:type="paragraph" w:customStyle="1" w:styleId="MDRKMCFCode">
-    <w:name w:val="MDRK MCF Code"/>
-    <w:basedOn w:val="MDRKTable"/>
-    <w:pPr>
-      <w:keepNext w:val="0"/>
-      <w:widowControl/>
-      <w:spacing w:before="0" w:after="0" w:line="240" w:lineRule="auto"/>
-      <w:jc w:val="center"/>
-    </w:pPr>
-    <w:rPr>
-      <w:rFonts w:ascii="Times New Roman" w:hAnsi="Times New Roman" w:eastAsia="Times New Roman" w:cs="Times New Roman"/>
-      <w:b w:val="0"/>
-      <w:color w:val="000000"/>
-      <w:sz w:val="20"/>
-    </w:rPr>
-  </w:style>
-  <w:style w:type="paragraph" w:customStyle="1" w:styleId="MDRKTask">
-    <w:name w:val="MDRK Task"/>
-    <w:basedOn w:val="ListNumber"/>
-    <w:pPr>
-      <w:keepNext w:val="0"/>
-      <w:widowControl/>
-      <w:spacing w:before="0" w:after="0" w:line="240" w:lineRule="auto"/>
-      <w:jc w:val="left"/>
-    </w:pPr>
-    <w:rPr>
-      <w:rFonts w:ascii="Times New Roman" w:hAnsi="Times New Roman" w:eastAsia="Times New Roman" w:cs="Times New Roman"/>
-      <w:b w:val="0"/>
-      <w:color w:val="000000"/>
-      <w:sz w:val="20"/>
-    </w:rPr>
-  </w:style>
-  <w:style w:type="paragraph" w:customStyle="1" w:styleId="MDRKWarning">
-    <w:name w:val="MDRK Warning"/>
-    <w:basedOn w:val="MDRKBody"/>
-    <w:pPr>
-      <w:keepNext w:val="0"/>
-      <w:widowControl/>
-      <w:spacing w:before="0" w:after="0" w:line="240" w:lineRule="auto"/>
-      <w:jc w:val="left"/>
-    </w:pPr>
-    <w:rPr>
-      <w:rFonts w:ascii="Times New Roman" w:hAnsi="Times New Roman" w:eastAsia="Times New Roman" w:cs="Times New Roman"/>
-      <w:b/>
-      <w:color w:val="000000"/>
-      <w:sz w:val="20"/>
+      <w:sz w:val="24"/>
     </w:rPr>
   </w:style>
   <w:style w:type="character" w:customStyle="1" w:styleId="MDRKLabel">
@@ -12236,7 +12236,7 @@
       <w:rFonts w:ascii="Times New Roman" w:hAnsi="Times New Roman" w:eastAsia="Times New Roman" w:cs="Times New Roman"/>
       <w:b/>
       <w:color w:val="000000"/>
-      <w:sz w:val="20"/>
+      <w:sz w:val="24"/>
     </w:rPr>
   </w:style>
 </w:styles>

</xml_diff>

<commit_message>
release: prepare internal MDRK Builder 1.0.0
</commit_message>
<xml_diff>
--- a/src/mdrk_builder/resources/canonical_mdrk_template.docx
+++ b/src/mdrk_builder/resources/canonical_mdrk_template.docx
@@ -390,7 +390,6 @@
   <w:style w:type="paragraph" w:default="1" w:styleId="Normal">
     <w:name w:val="Normal"/>
     <w:qFormat/>
-    <w:rsid w:val="00FC693F"/>
     <w:pPr>
       <w:keepNext w:val="0"/>
       <w:widowControl/>
@@ -410,7 +409,6 @@
     <w:link w:val="HeaderChar"/>
     <w:uiPriority w:val="99"/>
     <w:unhideWhenUsed/>
-    <w:rsid w:val="00E618BF"/>
     <w:pPr>
       <w:tabs>
         <w:tab w:val="center" w:pos="4680"/>
@@ -424,7 +422,6 @@
     <w:basedOn w:val="DefaultParagraphFont"/>
     <w:link w:val="Header"/>
     <w:uiPriority w:val="99"/>
-    <w:rsid w:val="00E618BF"/>
   </w:style>
   <w:style w:type="paragraph" w:styleId="Footer">
     <w:name w:val="footer"/>
@@ -432,7 +429,6 @@
     <w:link w:val="FooterChar"/>
     <w:uiPriority w:val="99"/>
     <w:unhideWhenUsed/>
-    <w:rsid w:val="00E618BF"/>
     <w:pPr>
       <w:tabs>
         <w:tab w:val="center" w:pos="4680"/>
@@ -446,7 +442,6 @@
     <w:basedOn w:val="DefaultParagraphFont"/>
     <w:link w:val="Footer"/>
     <w:uiPriority w:val="99"/>
-    <w:rsid w:val="00E618BF"/>
   </w:style>
   <w:style w:type="paragraph" w:styleId="Heading1">
     <w:name w:val="heading 1"/>
@@ -455,7 +450,6 @@
     <w:link w:val="Heading1Char"/>
     <w:uiPriority w:val="9"/>
     <w:qFormat/>
-    <w:rsid w:val="00FC693F"/>
     <w:pPr>
       <w:keepNext/>
       <w:keepLines/>
@@ -479,7 +473,6 @@
     <w:uiPriority w:val="9"/>
     <w:unhideWhenUsed/>
     <w:qFormat/>
-    <w:rsid w:val="00FC693F"/>
     <w:pPr>
       <w:keepNext/>
       <w:keepLines/>
@@ -503,7 +496,6 @@
     <w:uiPriority w:val="9"/>
     <w:unhideWhenUsed/>
     <w:qFormat/>
-    <w:rsid w:val="00FC693F"/>
     <w:pPr>
       <w:keepNext/>
       <w:keepLines/>
@@ -526,7 +518,6 @@
     <w:semiHidden/>
     <w:unhideWhenUsed/>
     <w:qFormat/>
-    <w:rsid w:val="00FC693F"/>
     <w:pPr>
       <w:keepNext/>
       <w:keepLines/>
@@ -551,7 +542,6 @@
     <w:semiHidden/>
     <w:unhideWhenUsed/>
     <w:qFormat/>
-    <w:rsid w:val="00FC693F"/>
     <w:pPr>
       <w:keepNext/>
       <w:keepLines/>
@@ -572,7 +562,6 @@
     <w:semiHidden/>
     <w:unhideWhenUsed/>
     <w:qFormat/>
-    <w:rsid w:val="00FC693F"/>
     <w:pPr>
       <w:keepNext/>
       <w:keepLines/>
@@ -595,7 +584,6 @@
     <w:semiHidden/>
     <w:unhideWhenUsed/>
     <w:qFormat/>
-    <w:rsid w:val="00FC693F"/>
     <w:pPr>
       <w:keepNext/>
       <w:keepLines/>
@@ -618,7 +606,6 @@
     <w:semiHidden/>
     <w:unhideWhenUsed/>
     <w:qFormat/>
-    <w:rsid w:val="00FC693F"/>
     <w:pPr>
       <w:keepNext/>
       <w:keepLines/>
@@ -641,7 +628,6 @@
     <w:semiHidden/>
     <w:unhideWhenUsed/>
     <w:qFormat/>
-    <w:rsid w:val="00FC693F"/>
     <w:pPr>
       <w:keepNext/>
       <w:keepLines/>
@@ -688,7 +674,6 @@
     <w:name w:val="No Spacing"/>
     <w:uiPriority w:val="1"/>
     <w:qFormat/>
-    <w:rsid w:val="00FC693F"/>
     <w:pPr>
       <w:spacing w:after="0" w:line="240" w:lineRule="auto"/>
     </w:pPr>
@@ -698,7 +683,6 @@
     <w:basedOn w:val="DefaultParagraphFont"/>
     <w:link w:val="Heading1"/>
     <w:uiPriority w:val="9"/>
-    <w:rsid w:val="00FC693F"/>
     <w:rPr>
       <w:rFonts w:asciiTheme="majorHAnsi" w:eastAsiaTheme="majorEastAsia" w:hAnsiTheme="majorHAnsi" w:cstheme="majorBidi"/>
       <w:b/>
@@ -713,7 +697,6 @@
     <w:basedOn w:val="DefaultParagraphFont"/>
     <w:link w:val="Heading2"/>
     <w:uiPriority w:val="9"/>
-    <w:rsid w:val="00FC693F"/>
     <w:rPr>
       <w:rFonts w:asciiTheme="majorHAnsi" w:eastAsiaTheme="majorEastAsia" w:hAnsiTheme="majorHAnsi" w:cstheme="majorBidi"/>
       <w:b/>
@@ -728,7 +711,6 @@
     <w:basedOn w:val="DefaultParagraphFont"/>
     <w:link w:val="Heading3"/>
     <w:uiPriority w:val="9"/>
-    <w:rsid w:val="00FC693F"/>
     <w:rPr>
       <w:rFonts w:asciiTheme="majorHAnsi" w:eastAsiaTheme="majorEastAsia" w:hAnsiTheme="majorHAnsi" w:cstheme="majorBidi"/>
       <w:b/>
@@ -743,7 +725,6 @@
     <w:link w:val="TitleChar"/>
     <w:uiPriority w:val="10"/>
     <w:qFormat/>
-    <w:rsid w:val="00FC693F"/>
     <w:pPr>
       <w:pBdr>
         <w:bottom w:val="single" w:sz="8" w:space="4" w:color="4F81BD" w:themeColor="accent1"/>
@@ -765,7 +746,6 @@
     <w:basedOn w:val="DefaultParagraphFont"/>
     <w:link w:val="Title"/>
     <w:uiPriority w:val="10"/>
-    <w:rsid w:val="00FC693F"/>
     <w:rPr>
       <w:rFonts w:asciiTheme="majorHAnsi" w:eastAsiaTheme="majorEastAsia" w:hAnsiTheme="majorHAnsi" w:cstheme="majorBidi"/>
       <w:color w:val="17365D" w:themeColor="text2" w:themeShade="BF"/>
@@ -782,7 +762,6 @@
     <w:link w:val="SubtitleChar"/>
     <w:uiPriority w:val="11"/>
     <w:qFormat/>
-    <w:rsid w:val="00FC693F"/>
     <w:pPr>
       <w:numPr>
         <w:ilvl w:val="1"/>
@@ -803,7 +782,6 @@
     <w:basedOn w:val="DefaultParagraphFont"/>
     <w:link w:val="Subtitle"/>
     <w:uiPriority w:val="11"/>
-    <w:rsid w:val="00FC693F"/>
     <w:rPr>
       <w:rFonts w:asciiTheme="majorHAnsi" w:eastAsiaTheme="majorEastAsia" w:hAnsiTheme="majorHAnsi" w:cstheme="majorBidi"/>
       <w:i/>
@@ -819,7 +797,6 @@
     <w:basedOn w:val="Normal"/>
     <w:uiPriority w:val="34"/>
     <w:qFormat/>
-    <w:rsid w:val="00FC693F"/>
     <w:pPr>
       <w:ind w:left="720"/>
       <w:contextualSpacing/>
@@ -831,7 +808,6 @@
     <w:link w:val="BodyTextChar"/>
     <w:uiPriority w:val="99"/>
     <w:unhideWhenUsed/>
-    <w:rsid w:val="00AA1D8D"/>
     <w:pPr>
       <w:spacing w:after="120"/>
     </w:pPr>
@@ -841,7 +817,6 @@
     <w:basedOn w:val="DefaultParagraphFont"/>
     <w:link w:val="BodyText"/>
     <w:uiPriority w:val="99"/>
-    <w:rsid w:val="00AA1D8D"/>
   </w:style>
   <w:style w:type="paragraph" w:styleId="BodyText2">
     <w:name w:val="Body Text 2"/>
@@ -849,7 +824,6 @@
     <w:link w:val="BodyText2Char"/>
     <w:uiPriority w:val="99"/>
     <w:unhideWhenUsed/>
-    <w:rsid w:val="00AA1D8D"/>
     <w:pPr>
       <w:spacing w:after="120" w:line="480" w:lineRule="auto"/>
     </w:pPr>
@@ -859,7 +833,6 @@
     <w:basedOn w:val="DefaultParagraphFont"/>
     <w:link w:val="BodyText2"/>
     <w:uiPriority w:val="99"/>
-    <w:rsid w:val="00AA1D8D"/>
   </w:style>
   <w:style w:type="paragraph" w:styleId="BodyText3">
     <w:name w:val="Body Text 3"/>
@@ -867,7 +840,6 @@
     <w:link w:val="BodyText3Char"/>
     <w:uiPriority w:val="99"/>
     <w:unhideWhenUsed/>
-    <w:rsid w:val="00AA1D8D"/>
     <w:pPr>
       <w:spacing w:after="120"/>
     </w:pPr>
@@ -881,7 +853,6 @@
     <w:basedOn w:val="DefaultParagraphFont"/>
     <w:link w:val="BodyText3"/>
     <w:uiPriority w:val="99"/>
-    <w:rsid w:val="00AA1D8D"/>
     <w:rPr>
       <w:sz w:val="16"/>
       <w:szCs w:val="16"/>
@@ -892,7 +863,6 @@
     <w:basedOn w:val="Normal"/>
     <w:uiPriority w:val="99"/>
     <w:unhideWhenUsed/>
-    <w:rsid w:val="00AA1D8D"/>
     <w:pPr>
       <w:ind w:left="360" w:hanging="360"/>
       <w:contextualSpacing/>
@@ -903,7 +873,6 @@
     <w:basedOn w:val="Normal"/>
     <w:uiPriority w:val="99"/>
     <w:unhideWhenUsed/>
-    <w:rsid w:val="00326F90"/>
     <w:pPr>
       <w:ind w:left="720" w:hanging="360"/>
       <w:contextualSpacing/>
@@ -914,7 +883,6 @@
     <w:basedOn w:val="Normal"/>
     <w:uiPriority w:val="99"/>
     <w:unhideWhenUsed/>
-    <w:rsid w:val="00326F90"/>
     <w:pPr>
       <w:ind w:left="1080" w:hanging="360"/>
       <w:contextualSpacing/>
@@ -925,7 +893,6 @@
     <w:basedOn w:val="Normal"/>
     <w:uiPriority w:val="99"/>
     <w:unhideWhenUsed/>
-    <w:rsid w:val="00326F90"/>
     <w:pPr>
       <w:numPr>
         <w:numId w:val="1"/>
@@ -938,7 +905,6 @@
     <w:basedOn w:val="Normal"/>
     <w:uiPriority w:val="99"/>
     <w:unhideWhenUsed/>
-    <w:rsid w:val="00326F90"/>
     <w:pPr>
       <w:numPr>
         <w:numId w:val="2"/>
@@ -951,7 +917,6 @@
     <w:basedOn w:val="Normal"/>
     <w:uiPriority w:val="99"/>
     <w:unhideWhenUsed/>
-    <w:rsid w:val="00326F90"/>
     <w:pPr>
       <w:numPr>
         <w:numId w:val="3"/>
@@ -964,7 +929,6 @@
     <w:basedOn w:val="Normal"/>
     <w:uiPriority w:val="99"/>
     <w:unhideWhenUsed/>
-    <w:rsid w:val="00326F90"/>
     <w:pPr>
       <w:numPr>
         <w:numId w:val="5"/>
@@ -977,7 +941,6 @@
     <w:basedOn w:val="Normal"/>
     <w:uiPriority w:val="99"/>
     <w:unhideWhenUsed/>
-    <w:rsid w:val="0029639D"/>
     <w:pPr>
       <w:numPr>
         <w:numId w:val="6"/>
@@ -990,7 +953,6 @@
     <w:basedOn w:val="Normal"/>
     <w:uiPriority w:val="99"/>
     <w:unhideWhenUsed/>
-    <w:rsid w:val="0029639D"/>
     <w:pPr>
       <w:numPr>
         <w:numId w:val="7"/>
@@ -1003,7 +965,6 @@
     <w:basedOn w:val="Normal"/>
     <w:uiPriority w:val="99"/>
     <w:unhideWhenUsed/>
-    <w:rsid w:val="0029639D"/>
     <w:pPr>
       <w:spacing w:after="120"/>
       <w:ind w:left="360"/>
@@ -1015,7 +976,6 @@
     <w:basedOn w:val="Normal"/>
     <w:uiPriority w:val="99"/>
     <w:unhideWhenUsed/>
-    <w:rsid w:val="0029639D"/>
     <w:pPr>
       <w:spacing w:after="120"/>
       <w:ind w:left="720"/>
@@ -1027,7 +987,6 @@
     <w:basedOn w:val="Normal"/>
     <w:uiPriority w:val="99"/>
     <w:unhideWhenUsed/>
-    <w:rsid w:val="0029639D"/>
     <w:pPr>
       <w:spacing w:after="120"/>
       <w:ind w:left="1080"/>
@@ -1039,7 +998,6 @@
     <w:link w:val="MacroTextChar"/>
     <w:uiPriority w:val="99"/>
     <w:unhideWhenUsed/>
-    <w:rsid w:val="0029639D"/>
     <w:pPr>
       <w:tabs>
         <w:tab w:val="left" w:pos="576"/>
@@ -1062,7 +1020,6 @@
     <w:basedOn w:val="DefaultParagraphFont"/>
     <w:link w:val="MacroText"/>
     <w:uiPriority w:val="99"/>
-    <w:rsid w:val="0029639D"/>
     <w:rPr>
       <w:rFonts w:ascii="Courier" w:hAnsi="Courier"/>
       <w:sz w:val="20"/>
@@ -1076,7 +1033,6 @@
     <w:link w:val="QuoteChar"/>
     <w:uiPriority w:val="29"/>
     <w:qFormat/>
-    <w:rsid w:val="00FC693F"/>
     <w:rPr>
       <w:i/>
       <w:iCs/>
@@ -1088,7 +1044,6 @@
     <w:basedOn w:val="DefaultParagraphFont"/>
     <w:link w:val="Quote"/>
     <w:uiPriority w:val="29"/>
-    <w:rsid w:val="00FC693F"/>
     <w:rPr>
       <w:i/>
       <w:iCs/>
@@ -1101,7 +1056,6 @@
     <w:link w:val="Heading4"/>
     <w:uiPriority w:val="9"/>
     <w:semiHidden/>
-    <w:rsid w:val="00FC693F"/>
     <w:rPr>
       <w:rFonts w:asciiTheme="majorHAnsi" w:eastAsiaTheme="majorEastAsia" w:hAnsiTheme="majorHAnsi" w:cstheme="majorBidi"/>
       <w:b/>
@@ -1117,7 +1071,6 @@
     <w:link w:val="Heading5"/>
     <w:uiPriority w:val="9"/>
     <w:semiHidden/>
-    <w:rsid w:val="00FC693F"/>
     <w:rPr>
       <w:rFonts w:asciiTheme="majorHAnsi" w:eastAsiaTheme="majorEastAsia" w:hAnsiTheme="majorHAnsi" w:cstheme="majorBidi"/>
       <w:color w:val="243F60" w:themeColor="accent1" w:themeShade="7F"/>
@@ -1129,7 +1082,6 @@
     <w:link w:val="Heading6"/>
     <w:uiPriority w:val="9"/>
     <w:semiHidden/>
-    <w:rsid w:val="00FC693F"/>
     <w:rPr>
       <w:rFonts w:asciiTheme="majorHAnsi" w:eastAsiaTheme="majorEastAsia" w:hAnsiTheme="majorHAnsi" w:cstheme="majorBidi"/>
       <w:i/>
@@ -1143,7 +1095,6 @@
     <w:link w:val="Heading7"/>
     <w:uiPriority w:val="9"/>
     <w:semiHidden/>
-    <w:rsid w:val="00FC693F"/>
     <w:rPr>
       <w:rFonts w:asciiTheme="majorHAnsi" w:eastAsiaTheme="majorEastAsia" w:hAnsiTheme="majorHAnsi" w:cstheme="majorBidi"/>
       <w:i/>
@@ -1157,7 +1108,6 @@
     <w:link w:val="Heading8"/>
     <w:uiPriority w:val="9"/>
     <w:semiHidden/>
-    <w:rsid w:val="00FC693F"/>
     <w:rPr>
       <w:rFonts w:asciiTheme="majorHAnsi" w:eastAsiaTheme="majorEastAsia" w:hAnsiTheme="majorHAnsi" w:cstheme="majorBidi"/>
       <w:color w:val="4F81BD" w:themeColor="accent1"/>
@@ -1171,7 +1121,6 @@
     <w:link w:val="Heading9"/>
     <w:uiPriority w:val="9"/>
     <w:semiHidden/>
-    <w:rsid w:val="00FC693F"/>
     <w:rPr>
       <w:rFonts w:asciiTheme="majorHAnsi" w:eastAsiaTheme="majorEastAsia" w:hAnsiTheme="majorHAnsi" w:cstheme="majorBidi"/>
       <w:i/>
@@ -1189,7 +1138,6 @@
     <w:semiHidden/>
     <w:unhideWhenUsed/>
     <w:qFormat/>
-    <w:rsid w:val="00FC693F"/>
     <w:pPr>
       <w:spacing w:line="240" w:lineRule="auto"/>
     </w:pPr>
@@ -1206,7 +1154,6 @@
     <w:basedOn w:val="DefaultParagraphFont"/>
     <w:uiPriority w:val="22"/>
     <w:qFormat/>
-    <w:rsid w:val="00FC693F"/>
     <w:rPr>
       <w:b/>
       <w:bCs/>
@@ -1217,7 +1164,6 @@
     <w:basedOn w:val="DefaultParagraphFont"/>
     <w:uiPriority w:val="20"/>
     <w:qFormat/>
-    <w:rsid w:val="00FC693F"/>
     <w:rPr>
       <w:i/>
       <w:iCs/>
@@ -1230,7 +1176,6 @@
     <w:link w:val="IntenseQuoteChar"/>
     <w:uiPriority w:val="30"/>
     <w:qFormat/>
-    <w:rsid w:val="00FC693F"/>
     <w:pPr>
       <w:pBdr>
         <w:bottom w:val="single" w:sz="4" w:space="4" w:color="4F81BD" w:themeColor="accent1"/>
@@ -1251,7 +1196,6 @@
     <w:basedOn w:val="DefaultParagraphFont"/>
     <w:link w:val="IntenseQuote"/>
     <w:uiPriority w:val="30"/>
-    <w:rsid w:val="00FC693F"/>
     <w:rPr>
       <w:b/>
       <w:bCs/>
@@ -1265,7 +1209,6 @@
     <w:basedOn w:val="DefaultParagraphFont"/>
     <w:uiPriority w:val="19"/>
     <w:qFormat/>
-    <w:rsid w:val="00FC693F"/>
     <w:rPr>
       <w:i/>
       <w:iCs/>
@@ -1277,7 +1220,6 @@
     <w:basedOn w:val="DefaultParagraphFont"/>
     <w:uiPriority w:val="21"/>
     <w:qFormat/>
-    <w:rsid w:val="00FC693F"/>
     <w:rPr>
       <w:b/>
       <w:bCs/>
@@ -1291,7 +1233,6 @@
     <w:basedOn w:val="DefaultParagraphFont"/>
     <w:uiPriority w:val="31"/>
     <w:qFormat/>
-    <w:rsid w:val="00FC693F"/>
     <w:rPr>
       <w:smallCaps/>
       <w:color w:val="C0504D" w:themeColor="accent2"/>
@@ -1303,7 +1244,6 @@
     <w:basedOn w:val="DefaultParagraphFont"/>
     <w:uiPriority w:val="32"/>
     <w:qFormat/>
-    <w:rsid w:val="00FC693F"/>
     <w:rPr>
       <w:b/>
       <w:bCs/>
@@ -1318,7 +1258,6 @@
     <w:basedOn w:val="DefaultParagraphFont"/>
     <w:uiPriority w:val="33"/>
     <w:qFormat/>
-    <w:rsid w:val="00FC693F"/>
     <w:rPr>
       <w:b/>
       <w:bCs/>
@@ -1334,7 +1273,6 @@
     <w:semiHidden/>
     <w:unhideWhenUsed/>
     <w:qFormat/>
-    <w:rsid w:val="00FC693F"/>
     <w:pPr>
       <w:outlineLvl w:val="9"/>
     </w:pPr>
@@ -1343,7 +1281,6 @@
     <w:name w:val="Table Grid"/>
     <w:basedOn w:val="TableNormal"/>
     <w:uiPriority w:val="59"/>
-    <w:rsid w:val="00FC693F"/>
     <w:pPr>
       <w:spacing w:after="0" w:line="240" w:lineRule="auto"/>
     </w:pPr>
@@ -1369,7 +1306,6 @@
     <w:name w:val="Light Shading"/>
     <w:basedOn w:val="TableNormal"/>
     <w:uiPriority w:val="60"/>
-    <w:rsid w:val="00FC693F"/>
     <w:pPr>
       <w:spacing w:after="0" w:line="240" w:lineRule="auto"/>
     </w:pPr>
@@ -1472,7 +1408,6 @@
     <w:name w:val="Light Shading Accent 1"/>
     <w:basedOn w:val="TableNormal"/>
     <w:uiPriority w:val="60"/>
-    <w:rsid w:val="00FC693F"/>
     <w:pPr>
       <w:spacing w:after="0" w:line="240" w:lineRule="auto"/>
     </w:pPr>
@@ -1575,7 +1510,6 @@
     <w:name w:val="Light Shading Accent 2"/>
     <w:basedOn w:val="TableNormal"/>
     <w:uiPriority w:val="60"/>
-    <w:rsid w:val="00FC693F"/>
     <w:pPr>
       <w:spacing w:after="0" w:line="240" w:lineRule="auto"/>
     </w:pPr>
@@ -1678,7 +1612,6 @@
     <w:name w:val="Light Shading Accent 3"/>
     <w:basedOn w:val="TableNormal"/>
     <w:uiPriority w:val="60"/>
-    <w:rsid w:val="00FC693F"/>
     <w:pPr>
       <w:spacing w:after="0" w:line="240" w:lineRule="auto"/>
     </w:pPr>
@@ -1781,7 +1714,6 @@
     <w:name w:val="Light Shading Accent 4"/>
     <w:basedOn w:val="TableNormal"/>
     <w:uiPriority w:val="60"/>
-    <w:rsid w:val="00FC693F"/>
     <w:pPr>
       <w:spacing w:after="0" w:line="240" w:lineRule="auto"/>
     </w:pPr>
@@ -1884,7 +1816,6 @@
     <w:name w:val="Light Shading Accent 5"/>
     <w:basedOn w:val="TableNormal"/>
     <w:uiPriority w:val="60"/>
-    <w:rsid w:val="00FC693F"/>
     <w:pPr>
       <w:spacing w:after="0" w:line="240" w:lineRule="auto"/>
     </w:pPr>
@@ -1987,7 +1918,6 @@
     <w:name w:val="Light Shading Accent 6"/>
     <w:basedOn w:val="TableNormal"/>
     <w:uiPriority w:val="60"/>
-    <w:rsid w:val="00FC693F"/>
     <w:pPr>
       <w:spacing w:after="0" w:line="240" w:lineRule="auto"/>
     </w:pPr>
@@ -2090,7 +2020,6 @@
     <w:name w:val="Light List"/>
     <w:basedOn w:val="TableNormal"/>
     <w:uiPriority w:val="61"/>
-    <w:rsid w:val="00FC693F"/>
     <w:pPr>
       <w:spacing w:after="0" w:line="240" w:lineRule="auto"/>
     </w:pPr>
@@ -2182,7 +2111,6 @@
     <w:name w:val="Light List Accent 1"/>
     <w:basedOn w:val="TableNormal"/>
     <w:uiPriority w:val="61"/>
-    <w:rsid w:val="00FC693F"/>
     <w:pPr>
       <w:spacing w:after="0" w:line="240" w:lineRule="auto"/>
     </w:pPr>
@@ -2274,7 +2202,6 @@
     <w:name w:val="Light List Accent 2"/>
     <w:basedOn w:val="TableNormal"/>
     <w:uiPriority w:val="61"/>
-    <w:rsid w:val="00CB0664"/>
     <w:pPr>
       <w:spacing w:after="0" w:line="240" w:lineRule="auto"/>
     </w:pPr>
@@ -2366,7 +2293,6 @@
     <w:name w:val="Light List Accent 3"/>
     <w:basedOn w:val="TableNormal"/>
     <w:uiPriority w:val="61"/>
-    <w:rsid w:val="00CB0664"/>
     <w:pPr>
       <w:spacing w:after="0" w:line="240" w:lineRule="auto"/>
     </w:pPr>
@@ -2458,7 +2384,6 @@
     <w:name w:val="Light List Accent 4"/>
     <w:basedOn w:val="TableNormal"/>
     <w:uiPriority w:val="61"/>
-    <w:rsid w:val="00CB0664"/>
     <w:pPr>
       <w:spacing w:after="0" w:line="240" w:lineRule="auto"/>
     </w:pPr>
@@ -2550,7 +2475,6 @@
     <w:name w:val="Light List Accent 5"/>
     <w:basedOn w:val="TableNormal"/>
     <w:uiPriority w:val="61"/>
-    <w:rsid w:val="00CB0664"/>
     <w:pPr>
       <w:spacing w:after="0" w:line="240" w:lineRule="auto"/>
     </w:pPr>
@@ -2642,7 +2566,6 @@
     <w:name w:val="Light List Accent 6"/>
     <w:basedOn w:val="TableNormal"/>
     <w:uiPriority w:val="61"/>
-    <w:rsid w:val="00CB0664"/>
     <w:pPr>
       <w:spacing w:after="0" w:line="240" w:lineRule="auto"/>
     </w:pPr>
@@ -2734,7 +2657,6 @@
     <w:name w:val="Light Grid"/>
     <w:basedOn w:val="TableNormal"/>
     <w:uiPriority w:val="62"/>
-    <w:rsid w:val="00CB0664"/>
     <w:pPr>
       <w:spacing w:after="0" w:line="240" w:lineRule="auto"/>
     </w:pPr>
@@ -2864,7 +2786,6 @@
     <w:name w:val="Light Grid Accent 1"/>
     <w:basedOn w:val="TableNormal"/>
     <w:uiPriority w:val="62"/>
-    <w:rsid w:val="00CB0664"/>
     <w:pPr>
       <w:spacing w:after="0" w:line="240" w:lineRule="auto"/>
     </w:pPr>
@@ -2994,7 +2915,6 @@
     <w:name w:val="Light Grid Accent 2"/>
     <w:basedOn w:val="TableNormal"/>
     <w:uiPriority w:val="62"/>
-    <w:rsid w:val="00CB0664"/>
     <w:pPr>
       <w:spacing w:after="0" w:line="240" w:lineRule="auto"/>
     </w:pPr>
@@ -3124,7 +3044,6 @@
     <w:name w:val="Light Grid Accent 3"/>
     <w:basedOn w:val="TableNormal"/>
     <w:uiPriority w:val="62"/>
-    <w:rsid w:val="00CB0664"/>
     <w:pPr>
       <w:spacing w:after="0" w:line="240" w:lineRule="auto"/>
     </w:pPr>
@@ -3254,7 +3173,6 @@
     <w:name w:val="Light Grid Accent 4"/>
     <w:basedOn w:val="TableNormal"/>
     <w:uiPriority w:val="62"/>
-    <w:rsid w:val="00CB0664"/>
     <w:pPr>
       <w:spacing w:after="0" w:line="240" w:lineRule="auto"/>
     </w:pPr>
@@ -3384,7 +3302,6 @@
     <w:name w:val="Light Grid Accent 5"/>
     <w:basedOn w:val="TableNormal"/>
     <w:uiPriority w:val="62"/>
-    <w:rsid w:val="00CB0664"/>
     <w:pPr>
       <w:spacing w:after="0" w:line="240" w:lineRule="auto"/>
     </w:pPr>
@@ -3514,7 +3431,6 @@
     <w:name w:val="Light Grid Accent 6"/>
     <w:basedOn w:val="TableNormal"/>
     <w:uiPriority w:val="62"/>
-    <w:rsid w:val="00CB0664"/>
     <w:pPr>
       <w:spacing w:after="0" w:line="240" w:lineRule="auto"/>
     </w:pPr>
@@ -3644,7 +3560,6 @@
     <w:name w:val="Medium Shading 1"/>
     <w:basedOn w:val="TableNormal"/>
     <w:uiPriority w:val="63"/>
-    <w:rsid w:val="00CB0664"/>
     <w:pPr>
       <w:spacing w:after="0" w:line="240" w:lineRule="auto"/>
     </w:pPr>
@@ -3750,7 +3665,6 @@
     <w:name w:val="Medium Shading 1 Accent 1"/>
     <w:basedOn w:val="TableNormal"/>
     <w:uiPriority w:val="63"/>
-    <w:rsid w:val="00CB0664"/>
     <w:pPr>
       <w:spacing w:after="0" w:line="240" w:lineRule="auto"/>
     </w:pPr>
@@ -3856,7 +3770,6 @@
     <w:name w:val="Medium Shading 1 Accent 2"/>
     <w:basedOn w:val="TableNormal"/>
     <w:uiPriority w:val="63"/>
-    <w:rsid w:val="00CB0664"/>
     <w:pPr>
       <w:spacing w:after="0" w:line="240" w:lineRule="auto"/>
     </w:pPr>
@@ -3962,7 +3875,6 @@
     <w:name w:val="Medium Shading 1 Accent 3"/>
     <w:basedOn w:val="TableNormal"/>
     <w:uiPriority w:val="63"/>
-    <w:rsid w:val="00CB0664"/>
     <w:pPr>
       <w:spacing w:after="0" w:line="240" w:lineRule="auto"/>
     </w:pPr>
@@ -4068,7 +3980,6 @@
     <w:name w:val="Medium Shading 1 Accent 4"/>
     <w:basedOn w:val="TableNormal"/>
     <w:uiPriority w:val="63"/>
-    <w:rsid w:val="00CB0664"/>
     <w:pPr>
       <w:spacing w:after="0" w:line="240" w:lineRule="auto"/>
     </w:pPr>
@@ -4174,7 +4085,6 @@
     <w:name w:val="Medium Shading 1 Accent 5"/>
     <w:basedOn w:val="TableNormal"/>
     <w:uiPriority w:val="63"/>
-    <w:rsid w:val="00CB0664"/>
     <w:pPr>
       <w:spacing w:after="0" w:line="240" w:lineRule="auto"/>
     </w:pPr>
@@ -4280,7 +4190,6 @@
     <w:name w:val="Medium Shading 1 Accent 6"/>
     <w:basedOn w:val="TableNormal"/>
     <w:uiPriority w:val="63"/>
-    <w:rsid w:val="00CB0664"/>
     <w:pPr>
       <w:spacing w:after="0" w:line="240" w:lineRule="auto"/>
     </w:pPr>
@@ -4386,7 +4295,6 @@
     <w:name w:val="Medium Shading 2"/>
     <w:basedOn w:val="TableNormal"/>
     <w:uiPriority w:val="64"/>
-    <w:rsid w:val="00CB0664"/>
     <w:pPr>
       <w:spacing w:after="0" w:line="240" w:lineRule="auto"/>
     </w:pPr>
@@ -4535,7 +4443,6 @@
     <w:name w:val="Medium Shading 2 Accent 1"/>
     <w:basedOn w:val="TableNormal"/>
     <w:uiPriority w:val="64"/>
-    <w:rsid w:val="00CB0664"/>
     <w:pPr>
       <w:spacing w:after="0" w:line="240" w:lineRule="auto"/>
     </w:pPr>
@@ -4684,7 +4591,6 @@
     <w:name w:val="Medium Shading 2 Accent 2"/>
     <w:basedOn w:val="TableNormal"/>
     <w:uiPriority w:val="64"/>
-    <w:rsid w:val="00CB0664"/>
     <w:pPr>
       <w:spacing w:after="0" w:line="240" w:lineRule="auto"/>
     </w:pPr>
@@ -4833,7 +4739,6 @@
     <w:name w:val="Medium Shading 2 Accent 3"/>
     <w:basedOn w:val="TableNormal"/>
     <w:uiPriority w:val="64"/>
-    <w:rsid w:val="00CB0664"/>
     <w:pPr>
       <w:spacing w:after="0" w:line="240" w:lineRule="auto"/>
     </w:pPr>
@@ -4982,7 +4887,6 @@
     <w:name w:val="Medium Shading 2 Accent 4"/>
     <w:basedOn w:val="TableNormal"/>
     <w:uiPriority w:val="64"/>
-    <w:rsid w:val="00CB0664"/>
     <w:pPr>
       <w:spacing w:after="0" w:line="240" w:lineRule="auto"/>
     </w:pPr>
@@ -5131,7 +5035,6 @@
     <w:name w:val="Medium Shading 2 Accent 5"/>
     <w:basedOn w:val="TableNormal"/>
     <w:uiPriority w:val="64"/>
-    <w:rsid w:val="00CB0664"/>
     <w:pPr>
       <w:spacing w:after="0" w:line="240" w:lineRule="auto"/>
     </w:pPr>
@@ -5280,7 +5183,6 @@
     <w:name w:val="Medium Shading 2 Accent 6"/>
     <w:basedOn w:val="TableNormal"/>
     <w:uiPriority w:val="64"/>
-    <w:rsid w:val="00CB0664"/>
     <w:pPr>
       <w:spacing w:after="0" w:line="240" w:lineRule="auto"/>
     </w:pPr>
@@ -5429,7 +5331,6 @@
     <w:name w:val="Medium List 1"/>
     <w:basedOn w:val="TableNormal"/>
     <w:uiPriority w:val="65"/>
-    <w:rsid w:val="00CB0664"/>
     <w:pPr>
       <w:spacing w:after="0" w:line="240" w:lineRule="auto"/>
     </w:pPr>
@@ -5513,7 +5414,6 @@
     <w:name w:val="Medium List 1 Accent 1"/>
     <w:basedOn w:val="TableNormal"/>
     <w:uiPriority w:val="65"/>
-    <w:rsid w:val="00CB0664"/>
     <w:pPr>
       <w:spacing w:after="0" w:line="240" w:lineRule="auto"/>
     </w:pPr>
@@ -5597,7 +5497,6 @@
     <w:name w:val="Medium List 1 Accent 2"/>
     <w:basedOn w:val="TableNormal"/>
     <w:uiPriority w:val="65"/>
-    <w:rsid w:val="00CB0664"/>
     <w:pPr>
       <w:spacing w:after="0" w:line="240" w:lineRule="auto"/>
     </w:pPr>
@@ -5681,7 +5580,6 @@
     <w:name w:val="Medium List 1 Accent 3"/>
     <w:basedOn w:val="TableNormal"/>
     <w:uiPriority w:val="65"/>
-    <w:rsid w:val="00CB0664"/>
     <w:pPr>
       <w:spacing w:after="0" w:line="240" w:lineRule="auto"/>
     </w:pPr>
@@ -5765,7 +5663,6 @@
     <w:name w:val="Medium List 1 Accent 4"/>
     <w:basedOn w:val="TableNormal"/>
     <w:uiPriority w:val="65"/>
-    <w:rsid w:val="00CB0664"/>
     <w:pPr>
       <w:spacing w:after="0" w:line="240" w:lineRule="auto"/>
     </w:pPr>
@@ -5849,7 +5746,6 @@
     <w:name w:val="Medium List 1 Accent 5"/>
     <w:basedOn w:val="TableNormal"/>
     <w:uiPriority w:val="65"/>
-    <w:rsid w:val="00CB0664"/>
     <w:pPr>
       <w:spacing w:after="0" w:line="240" w:lineRule="auto"/>
     </w:pPr>
@@ -5933,7 +5829,6 @@
     <w:name w:val="Medium List 1 Accent 6"/>
     <w:basedOn w:val="TableNormal"/>
     <w:uiPriority w:val="65"/>
-    <w:rsid w:val="00CB0664"/>
     <w:pPr>
       <w:spacing w:after="0" w:line="240" w:lineRule="auto"/>
     </w:pPr>
@@ -6017,7 +5912,6 @@
     <w:name w:val="Medium List 2"/>
     <w:basedOn w:val="TableNormal"/>
     <w:uiPriority w:val="66"/>
-    <w:rsid w:val="00CB0664"/>
     <w:pPr>
       <w:spacing w:after="0" w:line="240" w:lineRule="auto"/>
     </w:pPr>
@@ -6145,7 +6039,6 @@
     <w:name w:val="Medium List 2 Accent 1"/>
     <w:basedOn w:val="TableNormal"/>
     <w:uiPriority w:val="66"/>
-    <w:rsid w:val="00CB0664"/>
     <w:pPr>
       <w:spacing w:after="0" w:line="240" w:lineRule="auto"/>
     </w:pPr>
@@ -6273,7 +6166,6 @@
     <w:name w:val="Medium List 2 Accent 2"/>
     <w:basedOn w:val="TableNormal"/>
     <w:uiPriority w:val="66"/>
-    <w:rsid w:val="00CB0664"/>
     <w:pPr>
       <w:spacing w:after="0" w:line="240" w:lineRule="auto"/>
     </w:pPr>
@@ -6401,7 +6293,6 @@
     <w:name w:val="Medium List 2 Accent 3"/>
     <w:basedOn w:val="TableNormal"/>
     <w:uiPriority w:val="66"/>
-    <w:rsid w:val="00CB0664"/>
     <w:pPr>
       <w:spacing w:after="0" w:line="240" w:lineRule="auto"/>
     </w:pPr>
@@ -6529,7 +6420,6 @@
     <w:name w:val="Medium List 2 Accent 4"/>
     <w:basedOn w:val="TableNormal"/>
     <w:uiPriority w:val="66"/>
-    <w:rsid w:val="00CB0664"/>
     <w:pPr>
       <w:spacing w:after="0" w:line="240" w:lineRule="auto"/>
     </w:pPr>
@@ -6657,7 +6547,6 @@
     <w:name w:val="Medium List 2 Accent 5"/>
     <w:basedOn w:val="TableNormal"/>
     <w:uiPriority w:val="66"/>
-    <w:rsid w:val="00CB0664"/>
     <w:pPr>
       <w:spacing w:after="0" w:line="240" w:lineRule="auto"/>
     </w:pPr>
@@ -6785,7 +6674,6 @@
     <w:name w:val="Medium List 2 Accent 6"/>
     <w:basedOn w:val="TableNormal"/>
     <w:uiPriority w:val="66"/>
-    <w:rsid w:val="00CB0664"/>
     <w:pPr>
       <w:spacing w:after="0" w:line="240" w:lineRule="auto"/>
     </w:pPr>
@@ -6913,7 +6801,6 @@
     <w:name w:val="Medium Grid 1"/>
     <w:basedOn w:val="TableNormal"/>
     <w:uiPriority w:val="67"/>
-    <w:rsid w:val="00CB0664"/>
     <w:pPr>
       <w:spacing w:after="0" w:line="240" w:lineRule="auto"/>
     </w:pPr>
@@ -6986,7 +6873,6 @@
     <w:name w:val="Medium Grid 1 Accent 1"/>
     <w:basedOn w:val="TableNormal"/>
     <w:uiPriority w:val="67"/>
-    <w:rsid w:val="00CB0664"/>
     <w:pPr>
       <w:spacing w:after="0" w:line="240" w:lineRule="auto"/>
     </w:pPr>
@@ -7059,7 +6945,6 @@
     <w:name w:val="Medium Grid 1 Accent 2"/>
     <w:basedOn w:val="TableNormal"/>
     <w:uiPriority w:val="67"/>
-    <w:rsid w:val="00CB0664"/>
     <w:pPr>
       <w:spacing w:after="0" w:line="240" w:lineRule="auto"/>
     </w:pPr>
@@ -7132,7 +7017,6 @@
     <w:name w:val="Medium Grid 1 Accent 3"/>
     <w:basedOn w:val="TableNormal"/>
     <w:uiPriority w:val="67"/>
-    <w:rsid w:val="00CB0664"/>
     <w:pPr>
       <w:spacing w:after="0" w:line="240" w:lineRule="auto"/>
     </w:pPr>
@@ -7205,7 +7089,6 @@
     <w:name w:val="Medium Grid 1 Accent 4"/>
     <w:basedOn w:val="TableNormal"/>
     <w:uiPriority w:val="67"/>
-    <w:rsid w:val="00CB0664"/>
     <w:pPr>
       <w:spacing w:after="0" w:line="240" w:lineRule="auto"/>
     </w:pPr>
@@ -7278,7 +7161,6 @@
     <w:name w:val="Medium Grid 1 Accent 5"/>
     <w:basedOn w:val="TableNormal"/>
     <w:uiPriority w:val="67"/>
-    <w:rsid w:val="00CB0664"/>
     <w:pPr>
       <w:spacing w:after="0" w:line="240" w:lineRule="auto"/>
     </w:pPr>
@@ -7351,7 +7233,6 @@
     <w:name w:val="Medium Grid 1 Accent 6"/>
     <w:basedOn w:val="TableNormal"/>
     <w:uiPriority w:val="67"/>
-    <w:rsid w:val="00CB0664"/>
     <w:pPr>
       <w:spacing w:after="0" w:line="240" w:lineRule="auto"/>
     </w:pPr>
@@ -7424,7 +7305,6 @@
     <w:name w:val="Medium Grid 2"/>
     <w:basedOn w:val="TableNormal"/>
     <w:uiPriority w:val="68"/>
-    <w:rsid w:val="00CB0664"/>
     <w:pPr>
       <w:spacing w:after="0" w:line="240" w:lineRule="auto"/>
     </w:pPr>
@@ -7549,7 +7429,6 @@
     <w:name w:val="Medium Grid 2 Accent 1"/>
     <w:basedOn w:val="TableNormal"/>
     <w:uiPriority w:val="68"/>
-    <w:rsid w:val="00CB0664"/>
     <w:pPr>
       <w:spacing w:after="0" w:line="240" w:lineRule="auto"/>
     </w:pPr>
@@ -7674,7 +7553,6 @@
     <w:name w:val="Medium Grid 2 Accent 2"/>
     <w:basedOn w:val="TableNormal"/>
     <w:uiPriority w:val="68"/>
-    <w:rsid w:val="00CB0664"/>
     <w:pPr>
       <w:spacing w:after="0" w:line="240" w:lineRule="auto"/>
     </w:pPr>
@@ -7799,7 +7677,6 @@
     <w:name w:val="Medium Grid 2 Accent 3"/>
     <w:basedOn w:val="TableNormal"/>
     <w:uiPriority w:val="68"/>
-    <w:rsid w:val="00CB0664"/>
     <w:pPr>
       <w:spacing w:after="0" w:line="240" w:lineRule="auto"/>
     </w:pPr>
@@ -7924,7 +7801,6 @@
     <w:name w:val="Medium Grid 2 Accent 4"/>
     <w:basedOn w:val="TableNormal"/>
     <w:uiPriority w:val="68"/>
-    <w:rsid w:val="00CB0664"/>
     <w:pPr>
       <w:spacing w:after="0" w:line="240" w:lineRule="auto"/>
     </w:pPr>
@@ -8049,7 +7925,6 @@
     <w:name w:val="Medium Grid 2 Accent 5"/>
     <w:basedOn w:val="TableNormal"/>
     <w:uiPriority w:val="68"/>
-    <w:rsid w:val="00CB0664"/>
     <w:pPr>
       <w:spacing w:after="0" w:line="240" w:lineRule="auto"/>
     </w:pPr>
@@ -8174,7 +8049,6 @@
     <w:name w:val="Medium Grid 2 Accent 6"/>
     <w:basedOn w:val="TableNormal"/>
     <w:uiPriority w:val="68"/>
-    <w:rsid w:val="00CB0664"/>
     <w:pPr>
       <w:spacing w:after="0" w:line="240" w:lineRule="auto"/>
     </w:pPr>
@@ -8299,7 +8173,6 @@
     <w:name w:val="Medium Grid 3"/>
     <w:basedOn w:val="TableNormal"/>
     <w:uiPriority w:val="69"/>
-    <w:rsid w:val="00CB0664"/>
     <w:pPr>
       <w:spacing w:after="0" w:line="240" w:lineRule="auto"/>
     </w:pPr>
@@ -8440,7 +8313,6 @@
     <w:name w:val="Medium Grid 3 Accent 1"/>
     <w:basedOn w:val="TableNormal"/>
     <w:uiPriority w:val="69"/>
-    <w:rsid w:val="00CB0664"/>
     <w:pPr>
       <w:spacing w:after="0" w:line="240" w:lineRule="auto"/>
     </w:pPr>
@@ -8581,7 +8453,6 @@
     <w:name w:val="Medium Grid 3 Accent 2"/>
     <w:basedOn w:val="TableNormal"/>
     <w:uiPriority w:val="69"/>
-    <w:rsid w:val="00CB0664"/>
     <w:pPr>
       <w:spacing w:after="0" w:line="240" w:lineRule="auto"/>
     </w:pPr>
@@ -8722,7 +8593,6 @@
     <w:name w:val="Medium Grid 3 Accent 3"/>
     <w:basedOn w:val="TableNormal"/>
     <w:uiPriority w:val="69"/>
-    <w:rsid w:val="00CB0664"/>
     <w:pPr>
       <w:spacing w:after="0" w:line="240" w:lineRule="auto"/>
     </w:pPr>
@@ -8863,7 +8733,6 @@
     <w:name w:val="Medium Grid 3 Accent 4"/>
     <w:basedOn w:val="TableNormal"/>
     <w:uiPriority w:val="69"/>
-    <w:rsid w:val="00CB0664"/>
     <w:pPr>
       <w:spacing w:after="0" w:line="240" w:lineRule="auto"/>
     </w:pPr>
@@ -9004,7 +8873,6 @@
     <w:name w:val="Medium Grid 3 Accent 5"/>
     <w:basedOn w:val="TableNormal"/>
     <w:uiPriority w:val="69"/>
-    <w:rsid w:val="00CB0664"/>
     <w:pPr>
       <w:spacing w:after="0" w:line="240" w:lineRule="auto"/>
     </w:pPr>
@@ -9145,7 +9013,6 @@
     <w:name w:val="Medium Grid 3 Accent 6"/>
     <w:basedOn w:val="TableNormal"/>
     <w:uiPriority w:val="69"/>
-    <w:rsid w:val="00CB0664"/>
     <w:pPr>
       <w:spacing w:after="0" w:line="240" w:lineRule="auto"/>
     </w:pPr>
@@ -9286,7 +9153,6 @@
     <w:name w:val="Dark List"/>
     <w:basedOn w:val="TableNormal"/>
     <w:uiPriority w:val="70"/>
-    <w:rsid w:val="00CB0664"/>
     <w:pPr>
       <w:spacing w:after="0" w:line="240" w:lineRule="auto"/>
     </w:pPr>
@@ -9400,7 +9266,6 @@
     <w:name w:val="Dark List Accent 1"/>
     <w:basedOn w:val="TableNormal"/>
     <w:uiPriority w:val="70"/>
-    <w:rsid w:val="00CB0664"/>
     <w:pPr>
       <w:spacing w:after="0" w:line="240" w:lineRule="auto"/>
     </w:pPr>
@@ -9514,7 +9379,6 @@
     <w:name w:val="Dark List Accent 2"/>
     <w:basedOn w:val="TableNormal"/>
     <w:uiPriority w:val="70"/>
-    <w:rsid w:val="00CB0664"/>
     <w:pPr>
       <w:spacing w:after="0" w:line="240" w:lineRule="auto"/>
     </w:pPr>
@@ -9628,7 +9492,6 @@
     <w:name w:val="Dark List Accent 3"/>
     <w:basedOn w:val="TableNormal"/>
     <w:uiPriority w:val="70"/>
-    <w:rsid w:val="00CB0664"/>
     <w:pPr>
       <w:spacing w:after="0" w:line="240" w:lineRule="auto"/>
     </w:pPr>
@@ -9742,7 +9605,6 @@
     <w:name w:val="Dark List Accent 4"/>
     <w:basedOn w:val="TableNormal"/>
     <w:uiPriority w:val="70"/>
-    <w:rsid w:val="00CB0664"/>
     <w:pPr>
       <w:spacing w:after="0" w:line="240" w:lineRule="auto"/>
     </w:pPr>
@@ -9856,7 +9718,6 @@
     <w:name w:val="Dark List Accent 5"/>
     <w:basedOn w:val="TableNormal"/>
     <w:uiPriority w:val="70"/>
-    <w:rsid w:val="00CB0664"/>
     <w:pPr>
       <w:spacing w:after="0" w:line="240" w:lineRule="auto"/>
     </w:pPr>
@@ -9970,7 +9831,6 @@
     <w:name w:val="Dark List Accent 6"/>
     <w:basedOn w:val="TableNormal"/>
     <w:uiPriority w:val="70"/>
-    <w:rsid w:val="00CB0664"/>
     <w:pPr>
       <w:spacing w:after="0" w:line="240" w:lineRule="auto"/>
     </w:pPr>
@@ -10084,7 +9944,6 @@
     <w:name w:val="Colorful Shading"/>
     <w:basedOn w:val="TableNormal"/>
     <w:uiPriority w:val="71"/>
-    <w:rsid w:val="00CB0664"/>
     <w:pPr>
       <w:spacing w:after="0" w:line="240" w:lineRule="auto"/>
     </w:pPr>
@@ -10206,7 +10065,6 @@
     <w:name w:val="Colorful Shading Accent 1"/>
     <w:basedOn w:val="TableNormal"/>
     <w:uiPriority w:val="71"/>
-    <w:rsid w:val="00CB0664"/>
     <w:pPr>
       <w:spacing w:after="0" w:line="240" w:lineRule="auto"/>
     </w:pPr>
@@ -10328,7 +10186,6 @@
     <w:name w:val="Colorful Shading Accent 2"/>
     <w:basedOn w:val="TableNormal"/>
     <w:uiPriority w:val="71"/>
-    <w:rsid w:val="00CB0664"/>
     <w:pPr>
       <w:spacing w:after="0" w:line="240" w:lineRule="auto"/>
     </w:pPr>
@@ -10450,7 +10307,6 @@
     <w:name w:val="Colorful Shading Accent 3"/>
     <w:basedOn w:val="TableNormal"/>
     <w:uiPriority w:val="71"/>
-    <w:rsid w:val="00CB0664"/>
     <w:pPr>
       <w:spacing w:after="0" w:line="240" w:lineRule="auto"/>
     </w:pPr>
@@ -10562,7 +10418,6 @@
     <w:name w:val="Colorful Shading Accent 4"/>
     <w:basedOn w:val="TableNormal"/>
     <w:uiPriority w:val="71"/>
-    <w:rsid w:val="00CB0664"/>
     <w:pPr>
       <w:spacing w:after="0" w:line="240" w:lineRule="auto"/>
     </w:pPr>
@@ -10684,7 +10539,6 @@
     <w:name w:val="Colorful Shading Accent 5"/>
     <w:basedOn w:val="TableNormal"/>
     <w:uiPriority w:val="71"/>
-    <w:rsid w:val="00CB0664"/>
     <w:pPr>
       <w:spacing w:after="0" w:line="240" w:lineRule="auto"/>
     </w:pPr>
@@ -10806,7 +10660,6 @@
     <w:name w:val="Colorful Shading Accent 6"/>
     <w:basedOn w:val="TableNormal"/>
     <w:uiPriority w:val="71"/>
-    <w:rsid w:val="00CB0664"/>
     <w:pPr>
       <w:spacing w:after="0" w:line="240" w:lineRule="auto"/>
     </w:pPr>
@@ -10928,7 +10781,6 @@
     <w:name w:val="Colorful List"/>
     <w:basedOn w:val="TableNormal"/>
     <w:uiPriority w:val="72"/>
-    <w:rsid w:val="00CB0664"/>
     <w:pPr>
       <w:spacing w:after="0" w:line="240" w:lineRule="auto"/>
     </w:pPr>
@@ -11014,7 +10866,6 @@
     <w:name w:val="Colorful List Accent 1"/>
     <w:basedOn w:val="TableNormal"/>
     <w:uiPriority w:val="72"/>
-    <w:rsid w:val="00CB0664"/>
     <w:pPr>
       <w:spacing w:after="0" w:line="240" w:lineRule="auto"/>
     </w:pPr>
@@ -11100,7 +10951,6 @@
     <w:name w:val="Colorful List Accent 2"/>
     <w:basedOn w:val="TableNormal"/>
     <w:uiPriority w:val="72"/>
-    <w:rsid w:val="00CB0664"/>
     <w:pPr>
       <w:spacing w:after="0" w:line="240" w:lineRule="auto"/>
     </w:pPr>
@@ -11186,7 +11036,6 @@
     <w:name w:val="Colorful List Accent 3"/>
     <w:basedOn w:val="TableNormal"/>
     <w:uiPriority w:val="72"/>
-    <w:rsid w:val="00CB0664"/>
     <w:pPr>
       <w:spacing w:after="0" w:line="240" w:lineRule="auto"/>
     </w:pPr>
@@ -11272,7 +11121,6 @@
     <w:name w:val="Colorful List Accent 4"/>
     <w:basedOn w:val="TableNormal"/>
     <w:uiPriority w:val="72"/>
-    <w:rsid w:val="00CB0664"/>
     <w:pPr>
       <w:spacing w:after="0" w:line="240" w:lineRule="auto"/>
     </w:pPr>
@@ -11358,7 +11206,6 @@
     <w:name w:val="Colorful List Accent 5"/>
     <w:basedOn w:val="TableNormal"/>
     <w:uiPriority w:val="72"/>
-    <w:rsid w:val="00CB0664"/>
     <w:pPr>
       <w:spacing w:after="0" w:line="240" w:lineRule="auto"/>
     </w:pPr>
@@ -11444,7 +11291,6 @@
     <w:name w:val="Colorful List Accent 6"/>
     <w:basedOn w:val="TableNormal"/>
     <w:uiPriority w:val="72"/>
-    <w:rsid w:val="00CB0664"/>
     <w:pPr>
       <w:spacing w:after="0" w:line="240" w:lineRule="auto"/>
     </w:pPr>
@@ -11530,7 +11376,6 @@
     <w:name w:val="Colorful Grid"/>
     <w:basedOn w:val="TableNormal"/>
     <w:uiPriority w:val="73"/>
-    <w:rsid w:val="00CB0664"/>
     <w:pPr>
       <w:spacing w:after="0" w:line="240" w:lineRule="auto"/>
     </w:pPr>
@@ -11610,7 +11455,6 @@
     <w:name w:val="Colorful Grid Accent 1"/>
     <w:basedOn w:val="TableNormal"/>
     <w:uiPriority w:val="73"/>
-    <w:rsid w:val="00CB0664"/>
     <w:pPr>
       <w:spacing w:after="0" w:line="240" w:lineRule="auto"/>
     </w:pPr>
@@ -11690,7 +11534,6 @@
     <w:name w:val="Colorful Grid Accent 2"/>
     <w:basedOn w:val="TableNormal"/>
     <w:uiPriority w:val="73"/>
-    <w:rsid w:val="00CB0664"/>
     <w:pPr>
       <w:spacing w:after="0" w:line="240" w:lineRule="auto"/>
     </w:pPr>
@@ -11770,7 +11613,6 @@
     <w:name w:val="Colorful Grid Accent 3"/>
     <w:basedOn w:val="TableNormal"/>
     <w:uiPriority w:val="73"/>
-    <w:rsid w:val="00CB0664"/>
     <w:pPr>
       <w:spacing w:after="0" w:line="240" w:lineRule="auto"/>
     </w:pPr>
@@ -11850,7 +11692,6 @@
     <w:name w:val="Colorful Grid Accent 4"/>
     <w:basedOn w:val="TableNormal"/>
     <w:uiPriority w:val="73"/>
-    <w:rsid w:val="00CB0664"/>
     <w:pPr>
       <w:spacing w:after="0" w:line="240" w:lineRule="auto"/>
     </w:pPr>
@@ -11930,7 +11771,6 @@
     <w:name w:val="Colorful Grid Accent 5"/>
     <w:basedOn w:val="TableNormal"/>
     <w:uiPriority w:val="73"/>
-    <w:rsid w:val="00CB0664"/>
     <w:pPr>
       <w:spacing w:after="0" w:line="240" w:lineRule="auto"/>
     </w:pPr>
@@ -12010,7 +11850,6 @@
     <w:name w:val="Colorful Grid Accent 6"/>
     <w:basedOn w:val="TableNormal"/>
     <w:uiPriority w:val="73"/>
-    <w:rsid w:val="00CB0664"/>
     <w:pPr>
       <w:spacing w:after="0" w:line="240" w:lineRule="auto"/>
     </w:pPr>
@@ -12401,7 +12240,6 @@
   <w:style w:type="paragraph" w:default="1" w:styleId="Normal">
     <w:name w:val="Normal"/>
     <w:qFormat/>
-    <w:rsid w:val="00FC693F"/>
   </w:style>
   <w:style w:type="paragraph" w:styleId="Heading1">
     <w:name w:val="heading 1"/>
@@ -12410,7 +12248,6 @@
     <w:link w:val="Heading1Char"/>
     <w:uiPriority w:val="9"/>
     <w:qFormat/>
-    <w:rsid w:val="00FC693F"/>
     <w:pPr>
       <w:keepNext/>
       <w:keepLines/>
@@ -12434,7 +12271,6 @@
     <w:uiPriority w:val="9"/>
     <w:unhideWhenUsed/>
     <w:qFormat/>
-    <w:rsid w:val="00FC693F"/>
     <w:pPr>
       <w:keepNext/>
       <w:keepLines/>
@@ -12458,7 +12294,6 @@
     <w:uiPriority w:val="9"/>
     <w:unhideWhenUsed/>
     <w:qFormat/>
-    <w:rsid w:val="00FC693F"/>
     <w:pPr>
       <w:keepNext/>
       <w:keepLines/>
@@ -12481,7 +12316,6 @@
     <w:semiHidden/>
     <w:unhideWhenUsed/>
     <w:qFormat/>
-    <w:rsid w:val="00FC693F"/>
     <w:pPr>
       <w:keepNext/>
       <w:keepLines/>
@@ -12506,7 +12340,6 @@
     <w:semiHidden/>
     <w:unhideWhenUsed/>
     <w:qFormat/>
-    <w:rsid w:val="00FC693F"/>
     <w:pPr>
       <w:keepNext/>
       <w:keepLines/>
@@ -12527,7 +12360,6 @@
     <w:semiHidden/>
     <w:unhideWhenUsed/>
     <w:qFormat/>
-    <w:rsid w:val="00FC693F"/>
     <w:pPr>
       <w:keepNext/>
       <w:keepLines/>
@@ -12550,7 +12382,6 @@
     <w:semiHidden/>
     <w:unhideWhenUsed/>
     <w:qFormat/>
-    <w:rsid w:val="00FC693F"/>
     <w:pPr>
       <w:keepNext/>
       <w:keepLines/>
@@ -12573,7 +12404,6 @@
     <w:semiHidden/>
     <w:unhideWhenUsed/>
     <w:qFormat/>
-    <w:rsid w:val="00FC693F"/>
     <w:pPr>
       <w:keepNext/>
       <w:keepLines/>
@@ -12596,7 +12426,6 @@
     <w:semiHidden/>
     <w:unhideWhenUsed/>
     <w:qFormat/>
-    <w:rsid w:val="00FC693F"/>
     <w:pPr>
       <w:keepNext/>
       <w:keepLines/>
@@ -12643,7 +12472,6 @@
     <w:name w:val="No Spacing"/>
     <w:uiPriority w:val="1"/>
     <w:qFormat/>
-    <w:rsid w:val="00FC693F"/>
     <w:pPr>
       <w:spacing w:after="0" w:line="240" w:lineRule="auto"/>
     </w:pPr>
@@ -12653,7 +12481,6 @@
     <w:basedOn w:val="DefaultParagraphFont"/>
     <w:link w:val="Heading1"/>
     <w:uiPriority w:val="9"/>
-    <w:rsid w:val="00FC693F"/>
     <w:rPr>
       <w:rFonts w:asciiTheme="majorHAnsi" w:eastAsiaTheme="majorEastAsia" w:hAnsiTheme="majorHAnsi" w:cstheme="majorBidi"/>
       <w:b/>
@@ -12668,7 +12495,6 @@
     <w:basedOn w:val="DefaultParagraphFont"/>
     <w:link w:val="Heading2"/>
     <w:uiPriority w:val="9"/>
-    <w:rsid w:val="00FC693F"/>
     <w:rPr>
       <w:rFonts w:asciiTheme="majorHAnsi" w:eastAsiaTheme="majorEastAsia" w:hAnsiTheme="majorHAnsi" w:cstheme="majorBidi"/>
       <w:b/>
@@ -12683,7 +12509,6 @@
     <w:basedOn w:val="DefaultParagraphFont"/>
     <w:link w:val="Heading3"/>
     <w:uiPriority w:val="9"/>
-    <w:rsid w:val="00FC693F"/>
     <w:rPr>
       <w:rFonts w:asciiTheme="majorHAnsi" w:eastAsiaTheme="majorEastAsia" w:hAnsiTheme="majorHAnsi" w:cstheme="majorBidi"/>
       <w:b/>
@@ -12698,7 +12523,6 @@
     <w:link w:val="TitleChar"/>
     <w:uiPriority w:val="10"/>
     <w:qFormat/>
-    <w:rsid w:val="00FC693F"/>
     <w:pPr>
       <w:pBdr>
         <w:bottom w:val="single" w:sz="8" w:space="4" w:color="4F81BD" w:themeColor="accent1"/>
@@ -12720,7 +12544,6 @@
     <w:basedOn w:val="DefaultParagraphFont"/>
     <w:link w:val="Title"/>
     <w:uiPriority w:val="10"/>
-    <w:rsid w:val="00FC693F"/>
     <w:rPr>
       <w:rFonts w:asciiTheme="majorHAnsi" w:eastAsiaTheme="majorEastAsia" w:hAnsiTheme="majorHAnsi" w:cstheme="majorBidi"/>
       <w:color w:val="17365D" w:themeColor="text2" w:themeShade="BF"/>
@@ -12737,7 +12560,6 @@
     <w:link w:val="SubtitleChar"/>
     <w:uiPriority w:val="11"/>
     <w:qFormat/>
-    <w:rsid w:val="00FC693F"/>
     <w:pPr>
       <w:numPr>
         <w:ilvl w:val="1"/>
@@ -12758,7 +12580,6 @@
     <w:basedOn w:val="DefaultParagraphFont"/>
     <w:link w:val="Subtitle"/>
     <w:uiPriority w:val="11"/>
-    <w:rsid w:val="00FC693F"/>
     <w:rPr>
       <w:rFonts w:asciiTheme="majorHAnsi" w:eastAsiaTheme="majorEastAsia" w:hAnsiTheme="majorHAnsi" w:cstheme="majorBidi"/>
       <w:i/>
@@ -12774,7 +12595,6 @@
     <w:basedOn w:val="Normal"/>
     <w:uiPriority w:val="34"/>
     <w:qFormat/>
-    <w:rsid w:val="00FC693F"/>
     <w:pPr>
       <w:ind w:left="720"/>
       <w:contextualSpacing/>
@@ -12786,7 +12606,6 @@
     <w:link w:val="BodyTextChar"/>
     <w:uiPriority w:val="99"/>
     <w:unhideWhenUsed/>
-    <w:rsid w:val="00AA1D8D"/>
     <w:pPr>
       <w:spacing w:after="120"/>
     </w:pPr>
@@ -12796,7 +12615,6 @@
     <w:basedOn w:val="DefaultParagraphFont"/>
     <w:link w:val="BodyText"/>
     <w:uiPriority w:val="99"/>
-    <w:rsid w:val="00AA1D8D"/>
   </w:style>
   <w:style w:type="paragraph" w:styleId="BodyText2">
     <w:name w:val="Body Text 2"/>
@@ -12804,7 +12622,6 @@
     <w:link w:val="BodyText2Char"/>
     <w:uiPriority w:val="99"/>
     <w:unhideWhenUsed/>
-    <w:rsid w:val="00AA1D8D"/>
     <w:pPr>
       <w:spacing w:after="120" w:line="480" w:lineRule="auto"/>
     </w:pPr>
@@ -12814,7 +12631,6 @@
     <w:basedOn w:val="DefaultParagraphFont"/>
     <w:link w:val="BodyText2"/>
     <w:uiPriority w:val="99"/>
-    <w:rsid w:val="00AA1D8D"/>
   </w:style>
   <w:style w:type="paragraph" w:styleId="BodyText3">
     <w:name w:val="Body Text 3"/>
@@ -12822,7 +12638,6 @@
     <w:link w:val="BodyText3Char"/>
     <w:uiPriority w:val="99"/>
     <w:unhideWhenUsed/>
-    <w:rsid w:val="00AA1D8D"/>
     <w:pPr>
       <w:spacing w:after="120"/>
     </w:pPr>
@@ -12836,7 +12651,6 @@
     <w:basedOn w:val="DefaultParagraphFont"/>
     <w:link w:val="BodyText3"/>
     <w:uiPriority w:val="99"/>
-    <w:rsid w:val="00AA1D8D"/>
     <w:rPr>
       <w:sz w:val="16"/>
       <w:szCs w:val="16"/>
@@ -12847,7 +12661,6 @@
     <w:basedOn w:val="Normal"/>
     <w:uiPriority w:val="99"/>
     <w:unhideWhenUsed/>
-    <w:rsid w:val="00AA1D8D"/>
     <w:pPr>
       <w:ind w:left="360" w:hanging="360"/>
       <w:contextualSpacing/>
@@ -12858,7 +12671,6 @@
     <w:basedOn w:val="Normal"/>
     <w:uiPriority w:val="99"/>
     <w:unhideWhenUsed/>
-    <w:rsid w:val="00326F90"/>
     <w:pPr>
       <w:ind w:left="720" w:hanging="360"/>
       <w:contextualSpacing/>
@@ -12869,7 +12681,6 @@
     <w:basedOn w:val="Normal"/>
     <w:uiPriority w:val="99"/>
     <w:unhideWhenUsed/>
-    <w:rsid w:val="00326F90"/>
     <w:pPr>
       <w:ind w:left="1080" w:hanging="360"/>
       <w:contextualSpacing/>
@@ -12880,7 +12691,6 @@
     <w:basedOn w:val="Normal"/>
     <w:uiPriority w:val="99"/>
     <w:unhideWhenUsed/>
-    <w:rsid w:val="00326F90"/>
     <w:pPr>
       <w:numPr>
         <w:numId w:val="1"/>
@@ -12893,7 +12703,6 @@
     <w:basedOn w:val="Normal"/>
     <w:uiPriority w:val="99"/>
     <w:unhideWhenUsed/>
-    <w:rsid w:val="00326F90"/>
     <w:pPr>
       <w:numPr>
         <w:numId w:val="2"/>
@@ -12906,7 +12715,6 @@
     <w:basedOn w:val="Normal"/>
     <w:uiPriority w:val="99"/>
     <w:unhideWhenUsed/>
-    <w:rsid w:val="00326F90"/>
     <w:pPr>
       <w:numPr>
         <w:numId w:val="3"/>
@@ -12919,7 +12727,6 @@
     <w:basedOn w:val="Normal"/>
     <w:uiPriority w:val="99"/>
     <w:unhideWhenUsed/>
-    <w:rsid w:val="00326F90"/>
     <w:pPr>
       <w:numPr>
         <w:numId w:val="5"/>
@@ -12932,7 +12739,6 @@
     <w:basedOn w:val="Normal"/>
     <w:uiPriority w:val="99"/>
     <w:unhideWhenUsed/>
-    <w:rsid w:val="0029639D"/>
     <w:pPr>
       <w:numPr>
         <w:numId w:val="6"/>
@@ -12945,7 +12751,6 @@
     <w:basedOn w:val="Normal"/>
     <w:uiPriority w:val="99"/>
     <w:unhideWhenUsed/>
-    <w:rsid w:val="0029639D"/>
     <w:pPr>
       <w:numPr>
         <w:numId w:val="7"/>
@@ -12958,7 +12763,6 @@
     <w:basedOn w:val="Normal"/>
     <w:uiPriority w:val="99"/>
     <w:unhideWhenUsed/>
-    <w:rsid w:val="0029639D"/>
     <w:pPr>
       <w:spacing w:after="120"/>
       <w:ind w:left="360"/>
@@ -12970,7 +12774,6 @@
     <w:basedOn w:val="Normal"/>
     <w:uiPriority w:val="99"/>
     <w:unhideWhenUsed/>
-    <w:rsid w:val="0029639D"/>
     <w:pPr>
       <w:spacing w:after="120"/>
       <w:ind w:left="720"/>
@@ -12982,7 +12785,6 @@
     <w:basedOn w:val="Normal"/>
     <w:uiPriority w:val="99"/>
     <w:unhideWhenUsed/>
-    <w:rsid w:val="0029639D"/>
     <w:pPr>
       <w:spacing w:after="120"/>
       <w:ind w:left="1080"/>
@@ -12994,7 +12796,6 @@
     <w:link w:val="MacroTextChar"/>
     <w:uiPriority w:val="99"/>
     <w:unhideWhenUsed/>
-    <w:rsid w:val="0029639D"/>
     <w:pPr>
       <w:tabs>
         <w:tab w:val="left" w:pos="576"/>
@@ -13017,7 +12818,6 @@
     <w:basedOn w:val="DefaultParagraphFont"/>
     <w:link w:val="MacroText"/>
     <w:uiPriority w:val="99"/>
-    <w:rsid w:val="0029639D"/>
     <w:rPr>
       <w:rFonts w:ascii="Courier" w:hAnsi="Courier"/>
       <w:sz w:val="20"/>
@@ -13031,7 +12831,6 @@
     <w:link w:val="QuoteChar"/>
     <w:uiPriority w:val="29"/>
     <w:qFormat/>
-    <w:rsid w:val="00FC693F"/>
     <w:rPr>
       <w:i/>
       <w:iCs/>
@@ -13043,7 +12842,6 @@
     <w:basedOn w:val="DefaultParagraphFont"/>
     <w:link w:val="Quote"/>
     <w:uiPriority w:val="29"/>
-    <w:rsid w:val="00FC693F"/>
     <w:rPr>
       <w:i/>
       <w:iCs/>
@@ -13056,7 +12854,6 @@
     <w:link w:val="Heading4"/>
     <w:uiPriority w:val="9"/>
     <w:semiHidden/>
-    <w:rsid w:val="00FC693F"/>
     <w:rPr>
       <w:rFonts w:asciiTheme="majorHAnsi" w:eastAsiaTheme="majorEastAsia" w:hAnsiTheme="majorHAnsi" w:cstheme="majorBidi"/>
       <w:b/>
@@ -13072,7 +12869,6 @@
     <w:link w:val="Heading5"/>
     <w:uiPriority w:val="9"/>
     <w:semiHidden/>
-    <w:rsid w:val="00FC693F"/>
     <w:rPr>
       <w:rFonts w:asciiTheme="majorHAnsi" w:eastAsiaTheme="majorEastAsia" w:hAnsiTheme="majorHAnsi" w:cstheme="majorBidi"/>
       <w:color w:val="243F60" w:themeColor="accent1" w:themeShade="7F"/>
@@ -13084,7 +12880,6 @@
     <w:link w:val="Heading6"/>
     <w:uiPriority w:val="9"/>
     <w:semiHidden/>
-    <w:rsid w:val="00FC693F"/>
     <w:rPr>
       <w:rFonts w:asciiTheme="majorHAnsi" w:eastAsiaTheme="majorEastAsia" w:hAnsiTheme="majorHAnsi" w:cstheme="majorBidi"/>
       <w:i/>
@@ -13098,7 +12893,6 @@
     <w:link w:val="Heading7"/>
     <w:uiPriority w:val="9"/>
     <w:semiHidden/>
-    <w:rsid w:val="00FC693F"/>
     <w:rPr>
       <w:rFonts w:asciiTheme="majorHAnsi" w:eastAsiaTheme="majorEastAsia" w:hAnsiTheme="majorHAnsi" w:cstheme="majorBidi"/>
       <w:i/>
@@ -13112,7 +12906,6 @@
     <w:link w:val="Heading8"/>
     <w:uiPriority w:val="9"/>
     <w:semiHidden/>
-    <w:rsid w:val="00FC693F"/>
     <w:rPr>
       <w:rFonts w:asciiTheme="majorHAnsi" w:eastAsiaTheme="majorEastAsia" w:hAnsiTheme="majorHAnsi" w:cstheme="majorBidi"/>
       <w:color w:val="4F81BD" w:themeColor="accent1"/>
@@ -13126,7 +12919,6 @@
     <w:link w:val="Heading9"/>
     <w:uiPriority w:val="9"/>
     <w:semiHidden/>
-    <w:rsid w:val="00FC693F"/>
     <w:rPr>
       <w:rFonts w:asciiTheme="majorHAnsi" w:eastAsiaTheme="majorEastAsia" w:hAnsiTheme="majorHAnsi" w:cstheme="majorBidi"/>
       <w:i/>
@@ -13144,7 +12936,6 @@
     <w:semiHidden/>
     <w:unhideWhenUsed/>
     <w:qFormat/>
-    <w:rsid w:val="00FC693F"/>
     <w:pPr>
       <w:spacing w:line="240" w:lineRule="auto"/>
     </w:pPr>
@@ -13161,7 +12952,6 @@
     <w:basedOn w:val="DefaultParagraphFont"/>
     <w:uiPriority w:val="22"/>
     <w:qFormat/>
-    <w:rsid w:val="00FC693F"/>
     <w:rPr>
       <w:b/>
       <w:bCs/>
@@ -13172,7 +12962,6 @@
     <w:basedOn w:val="DefaultParagraphFont"/>
     <w:uiPriority w:val="20"/>
     <w:qFormat/>
-    <w:rsid w:val="00FC693F"/>
     <w:rPr>
       <w:i/>
       <w:iCs/>
@@ -13185,7 +12974,6 @@
     <w:link w:val="IntenseQuoteChar"/>
     <w:uiPriority w:val="30"/>
     <w:qFormat/>
-    <w:rsid w:val="00FC693F"/>
     <w:pPr>
       <w:pBdr>
         <w:bottom w:val="single" w:sz="4" w:space="4" w:color="4F81BD" w:themeColor="accent1"/>
@@ -13206,7 +12994,6 @@
     <w:basedOn w:val="DefaultParagraphFont"/>
     <w:link w:val="IntenseQuote"/>
     <w:uiPriority w:val="30"/>
-    <w:rsid w:val="00FC693F"/>
     <w:rPr>
       <w:b/>
       <w:bCs/>
@@ -13220,7 +13007,6 @@
     <w:basedOn w:val="DefaultParagraphFont"/>
     <w:uiPriority w:val="19"/>
     <w:qFormat/>
-    <w:rsid w:val="00FC693F"/>
     <w:rPr>
       <w:i/>
       <w:iCs/>
@@ -13232,7 +13018,6 @@
     <w:basedOn w:val="DefaultParagraphFont"/>
     <w:uiPriority w:val="21"/>
     <w:qFormat/>
-    <w:rsid w:val="00FC693F"/>
     <w:rPr>
       <w:b/>
       <w:bCs/>
@@ -13246,7 +13031,6 @@
     <w:basedOn w:val="DefaultParagraphFont"/>
     <w:uiPriority w:val="31"/>
     <w:qFormat/>
-    <w:rsid w:val="00FC693F"/>
     <w:rPr>
       <w:smallCaps/>
       <w:color w:val="C0504D" w:themeColor="accent2"/>
@@ -13258,7 +13042,6 @@
     <w:basedOn w:val="DefaultParagraphFont"/>
     <w:uiPriority w:val="32"/>
     <w:qFormat/>
-    <w:rsid w:val="00FC693F"/>
     <w:rPr>
       <w:b/>
       <w:bCs/>
@@ -13273,7 +13056,6 @@
     <w:basedOn w:val="DefaultParagraphFont"/>
     <w:uiPriority w:val="33"/>
     <w:qFormat/>
-    <w:rsid w:val="00FC693F"/>
     <w:rPr>
       <w:b/>
       <w:bCs/>
@@ -13289,7 +13071,6 @@
     <w:semiHidden/>
     <w:unhideWhenUsed/>
     <w:qFormat/>
-    <w:rsid w:val="00FC693F"/>
     <w:pPr>
       <w:outlineLvl w:val="9"/>
     </w:pPr>
@@ -13298,7 +13079,6 @@
     <w:name w:val="Table Grid"/>
     <w:basedOn w:val="TableNormal"/>
     <w:uiPriority w:val="59"/>
-    <w:rsid w:val="00FC693F"/>
     <w:pPr>
       <w:spacing w:after="0" w:line="240" w:lineRule="auto"/>
     </w:pPr>
@@ -13324,7 +13104,6 @@
     <w:name w:val="Light Shading"/>
     <w:basedOn w:val="TableNormal"/>
     <w:uiPriority w:val="60"/>
-    <w:rsid w:val="00FC693F"/>
     <w:pPr>
       <w:spacing w:after="0" w:line="240" w:lineRule="auto"/>
     </w:pPr>
@@ -13427,7 +13206,6 @@
     <w:name w:val="Light Shading Accent 1"/>
     <w:basedOn w:val="TableNormal"/>
     <w:uiPriority w:val="60"/>
-    <w:rsid w:val="00FC693F"/>
     <w:pPr>
       <w:spacing w:after="0" w:line="240" w:lineRule="auto"/>
     </w:pPr>
@@ -13530,7 +13308,6 @@
     <w:name w:val="Light Shading Accent 2"/>
     <w:basedOn w:val="TableNormal"/>
     <w:uiPriority w:val="60"/>
-    <w:rsid w:val="00FC693F"/>
     <w:pPr>
       <w:spacing w:after="0" w:line="240" w:lineRule="auto"/>
     </w:pPr>
@@ -13633,7 +13410,6 @@
     <w:name w:val="Light Shading Accent 3"/>
     <w:basedOn w:val="TableNormal"/>
     <w:uiPriority w:val="60"/>
-    <w:rsid w:val="00FC693F"/>
     <w:pPr>
       <w:spacing w:after="0" w:line="240" w:lineRule="auto"/>
     </w:pPr>
@@ -13736,7 +13512,6 @@
     <w:name w:val="Light Shading Accent 4"/>
     <w:basedOn w:val="TableNormal"/>
     <w:uiPriority w:val="60"/>
-    <w:rsid w:val="00FC693F"/>
     <w:pPr>
       <w:spacing w:after="0" w:line="240" w:lineRule="auto"/>
     </w:pPr>
@@ -13839,7 +13614,6 @@
     <w:name w:val="Light Shading Accent 5"/>
     <w:basedOn w:val="TableNormal"/>
     <w:uiPriority w:val="60"/>
-    <w:rsid w:val="00FC693F"/>
     <w:pPr>
       <w:spacing w:after="0" w:line="240" w:lineRule="auto"/>
     </w:pPr>
@@ -13942,7 +13716,6 @@
     <w:name w:val="Light Shading Accent 6"/>
     <w:basedOn w:val="TableNormal"/>
     <w:uiPriority w:val="60"/>
-    <w:rsid w:val="00FC693F"/>
     <w:pPr>
       <w:spacing w:after="0" w:line="240" w:lineRule="auto"/>
     </w:pPr>
@@ -14045,7 +13818,6 @@
     <w:name w:val="Light List"/>
     <w:basedOn w:val="TableNormal"/>
     <w:uiPriority w:val="61"/>
-    <w:rsid w:val="00FC693F"/>
     <w:pPr>
       <w:spacing w:after="0" w:line="240" w:lineRule="auto"/>
     </w:pPr>
@@ -14137,7 +13909,6 @@
     <w:name w:val="Light List Accent 1"/>
     <w:basedOn w:val="TableNormal"/>
     <w:uiPriority w:val="61"/>
-    <w:rsid w:val="00FC693F"/>
     <w:pPr>
       <w:spacing w:after="0" w:line="240" w:lineRule="auto"/>
     </w:pPr>
@@ -14229,7 +14000,6 @@
     <w:name w:val="Light List Accent 2"/>
     <w:basedOn w:val="TableNormal"/>
     <w:uiPriority w:val="61"/>
-    <w:rsid w:val="00CB0664"/>
     <w:pPr>
       <w:spacing w:after="0" w:line="240" w:lineRule="auto"/>
     </w:pPr>
@@ -14321,7 +14091,6 @@
     <w:name w:val="Light List Accent 3"/>
     <w:basedOn w:val="TableNormal"/>
     <w:uiPriority w:val="61"/>
-    <w:rsid w:val="00CB0664"/>
     <w:pPr>
       <w:spacing w:after="0" w:line="240" w:lineRule="auto"/>
     </w:pPr>
@@ -14413,7 +14182,6 @@
     <w:name w:val="Light List Accent 4"/>
     <w:basedOn w:val="TableNormal"/>
     <w:uiPriority w:val="61"/>
-    <w:rsid w:val="00CB0664"/>
     <w:pPr>
       <w:spacing w:after="0" w:line="240" w:lineRule="auto"/>
     </w:pPr>
@@ -14505,7 +14273,6 @@
     <w:name w:val="Light List Accent 5"/>
     <w:basedOn w:val="TableNormal"/>
     <w:uiPriority w:val="61"/>
-    <w:rsid w:val="00CB0664"/>
     <w:pPr>
       <w:spacing w:after="0" w:line="240" w:lineRule="auto"/>
     </w:pPr>
@@ -14597,7 +14364,6 @@
     <w:name w:val="Light List Accent 6"/>
     <w:basedOn w:val="TableNormal"/>
     <w:uiPriority w:val="61"/>
-    <w:rsid w:val="00CB0664"/>
     <w:pPr>
       <w:spacing w:after="0" w:line="240" w:lineRule="auto"/>
     </w:pPr>
@@ -14689,7 +14455,6 @@
     <w:name w:val="Light Grid"/>
     <w:basedOn w:val="TableNormal"/>
     <w:uiPriority w:val="62"/>
-    <w:rsid w:val="00CB0664"/>
     <w:pPr>
       <w:spacing w:after="0" w:line="240" w:lineRule="auto"/>
     </w:pPr>
@@ -14819,7 +14584,6 @@
     <w:name w:val="Light Grid Accent 1"/>
     <w:basedOn w:val="TableNormal"/>
     <w:uiPriority w:val="62"/>
-    <w:rsid w:val="00CB0664"/>
     <w:pPr>
       <w:spacing w:after="0" w:line="240" w:lineRule="auto"/>
     </w:pPr>
@@ -14949,7 +14713,6 @@
     <w:name w:val="Light Grid Accent 2"/>
     <w:basedOn w:val="TableNormal"/>
     <w:uiPriority w:val="62"/>
-    <w:rsid w:val="00CB0664"/>
     <w:pPr>
       <w:spacing w:after="0" w:line="240" w:lineRule="auto"/>
     </w:pPr>
@@ -15079,7 +14842,6 @@
     <w:name w:val="Light Grid Accent 3"/>
     <w:basedOn w:val="TableNormal"/>
     <w:uiPriority w:val="62"/>
-    <w:rsid w:val="00CB0664"/>
     <w:pPr>
       <w:spacing w:after="0" w:line="240" w:lineRule="auto"/>
     </w:pPr>
@@ -15209,7 +14971,6 @@
     <w:name w:val="Light Grid Accent 4"/>
     <w:basedOn w:val="TableNormal"/>
     <w:uiPriority w:val="62"/>
-    <w:rsid w:val="00CB0664"/>
     <w:pPr>
       <w:spacing w:after="0" w:line="240" w:lineRule="auto"/>
     </w:pPr>
@@ -15339,7 +15100,6 @@
     <w:name w:val="Light Grid Accent 5"/>
     <w:basedOn w:val="TableNormal"/>
     <w:uiPriority w:val="62"/>
-    <w:rsid w:val="00CB0664"/>
     <w:pPr>
       <w:spacing w:after="0" w:line="240" w:lineRule="auto"/>
     </w:pPr>
@@ -15469,7 +15229,6 @@
     <w:name w:val="Light Grid Accent 6"/>
     <w:basedOn w:val="TableNormal"/>
     <w:uiPriority w:val="62"/>
-    <w:rsid w:val="00CB0664"/>
     <w:pPr>
       <w:spacing w:after="0" w:line="240" w:lineRule="auto"/>
     </w:pPr>
@@ -15599,7 +15358,6 @@
     <w:name w:val="Medium Shading 1"/>
     <w:basedOn w:val="TableNormal"/>
     <w:uiPriority w:val="63"/>
-    <w:rsid w:val="00CB0664"/>
     <w:pPr>
       <w:spacing w:after="0" w:line="240" w:lineRule="auto"/>
     </w:pPr>
@@ -15705,7 +15463,6 @@
     <w:name w:val="Medium Shading 1 Accent 1"/>
     <w:basedOn w:val="TableNormal"/>
     <w:uiPriority w:val="63"/>
-    <w:rsid w:val="00CB0664"/>
     <w:pPr>
       <w:spacing w:after="0" w:line="240" w:lineRule="auto"/>
     </w:pPr>
@@ -15811,7 +15568,6 @@
     <w:name w:val="Medium Shading 1 Accent 2"/>
     <w:basedOn w:val="TableNormal"/>
     <w:uiPriority w:val="63"/>
-    <w:rsid w:val="00CB0664"/>
     <w:pPr>
       <w:spacing w:after="0" w:line="240" w:lineRule="auto"/>
     </w:pPr>
@@ -15917,7 +15673,6 @@
     <w:name w:val="Medium Shading 1 Accent 3"/>
     <w:basedOn w:val="TableNormal"/>
     <w:uiPriority w:val="63"/>
-    <w:rsid w:val="00CB0664"/>
     <w:pPr>
       <w:spacing w:after="0" w:line="240" w:lineRule="auto"/>
     </w:pPr>
@@ -16023,7 +15778,6 @@
     <w:name w:val="Medium Shading 1 Accent 4"/>
     <w:basedOn w:val="TableNormal"/>
     <w:uiPriority w:val="63"/>
-    <w:rsid w:val="00CB0664"/>
     <w:pPr>
       <w:spacing w:after="0" w:line="240" w:lineRule="auto"/>
     </w:pPr>
@@ -16129,7 +15883,6 @@
     <w:name w:val="Medium Shading 1 Accent 5"/>
     <w:basedOn w:val="TableNormal"/>
     <w:uiPriority w:val="63"/>
-    <w:rsid w:val="00CB0664"/>
     <w:pPr>
       <w:spacing w:after="0" w:line="240" w:lineRule="auto"/>
     </w:pPr>
@@ -16235,7 +15988,6 @@
     <w:name w:val="Medium Shading 1 Accent 6"/>
     <w:basedOn w:val="TableNormal"/>
     <w:uiPriority w:val="63"/>
-    <w:rsid w:val="00CB0664"/>
     <w:pPr>
       <w:spacing w:after="0" w:line="240" w:lineRule="auto"/>
     </w:pPr>
@@ -16341,7 +16093,6 @@
     <w:name w:val="Medium Shading 2"/>
     <w:basedOn w:val="TableNormal"/>
     <w:uiPriority w:val="64"/>
-    <w:rsid w:val="00CB0664"/>
     <w:pPr>
       <w:spacing w:after="0" w:line="240" w:lineRule="auto"/>
     </w:pPr>
@@ -16490,7 +16241,6 @@
     <w:name w:val="Medium Shading 2 Accent 1"/>
     <w:basedOn w:val="TableNormal"/>
     <w:uiPriority w:val="64"/>
-    <w:rsid w:val="00CB0664"/>
     <w:pPr>
       <w:spacing w:after="0" w:line="240" w:lineRule="auto"/>
     </w:pPr>
@@ -16639,7 +16389,6 @@
     <w:name w:val="Medium Shading 2 Accent 2"/>
     <w:basedOn w:val="TableNormal"/>
     <w:uiPriority w:val="64"/>
-    <w:rsid w:val="00CB0664"/>
     <w:pPr>
       <w:spacing w:after="0" w:line="240" w:lineRule="auto"/>
     </w:pPr>
@@ -16788,7 +16537,6 @@
     <w:name w:val="Medium Shading 2 Accent 3"/>
     <w:basedOn w:val="TableNormal"/>
     <w:uiPriority w:val="64"/>
-    <w:rsid w:val="00CB0664"/>
     <w:pPr>
       <w:spacing w:after="0" w:line="240" w:lineRule="auto"/>
     </w:pPr>
@@ -16937,7 +16685,6 @@
     <w:name w:val="Medium Shading 2 Accent 4"/>
     <w:basedOn w:val="TableNormal"/>
     <w:uiPriority w:val="64"/>
-    <w:rsid w:val="00CB0664"/>
     <w:pPr>
       <w:spacing w:after="0" w:line="240" w:lineRule="auto"/>
     </w:pPr>
@@ -17086,7 +16833,6 @@
     <w:name w:val="Medium Shading 2 Accent 5"/>
     <w:basedOn w:val="TableNormal"/>
     <w:uiPriority w:val="64"/>
-    <w:rsid w:val="00CB0664"/>
     <w:pPr>
       <w:spacing w:after="0" w:line="240" w:lineRule="auto"/>
     </w:pPr>
@@ -17235,7 +16981,6 @@
     <w:name w:val="Medium Shading 2 Accent 6"/>
     <w:basedOn w:val="TableNormal"/>
     <w:uiPriority w:val="64"/>
-    <w:rsid w:val="00CB0664"/>
     <w:pPr>
       <w:spacing w:after="0" w:line="240" w:lineRule="auto"/>
     </w:pPr>
@@ -17384,7 +17129,6 @@
     <w:name w:val="Medium List 1"/>
     <w:basedOn w:val="TableNormal"/>
     <w:uiPriority w:val="65"/>
-    <w:rsid w:val="00CB0664"/>
     <w:pPr>
       <w:spacing w:after="0" w:line="240" w:lineRule="auto"/>
     </w:pPr>
@@ -17468,7 +17212,6 @@
     <w:name w:val="Medium List 1 Accent 1"/>
     <w:basedOn w:val="TableNormal"/>
     <w:uiPriority w:val="65"/>
-    <w:rsid w:val="00CB0664"/>
     <w:pPr>
       <w:spacing w:after="0" w:line="240" w:lineRule="auto"/>
     </w:pPr>
@@ -17552,7 +17295,6 @@
     <w:name w:val="Medium List 1 Accent 2"/>
     <w:basedOn w:val="TableNormal"/>
     <w:uiPriority w:val="65"/>
-    <w:rsid w:val="00CB0664"/>
     <w:pPr>
       <w:spacing w:after="0" w:line="240" w:lineRule="auto"/>
     </w:pPr>
@@ -17636,7 +17378,6 @@
     <w:name w:val="Medium List 1 Accent 3"/>
     <w:basedOn w:val="TableNormal"/>
     <w:uiPriority w:val="65"/>
-    <w:rsid w:val="00CB0664"/>
     <w:pPr>
       <w:spacing w:after="0" w:line="240" w:lineRule="auto"/>
     </w:pPr>
@@ -17720,7 +17461,6 @@
     <w:name w:val="Medium List 1 Accent 4"/>
     <w:basedOn w:val="TableNormal"/>
     <w:uiPriority w:val="65"/>
-    <w:rsid w:val="00CB0664"/>
     <w:pPr>
       <w:spacing w:after="0" w:line="240" w:lineRule="auto"/>
     </w:pPr>
@@ -17804,7 +17544,6 @@
     <w:name w:val="Medium List 1 Accent 5"/>
     <w:basedOn w:val="TableNormal"/>
     <w:uiPriority w:val="65"/>
-    <w:rsid w:val="00CB0664"/>
     <w:pPr>
       <w:spacing w:after="0" w:line="240" w:lineRule="auto"/>
     </w:pPr>
@@ -17888,7 +17627,6 @@
     <w:name w:val="Medium List 1 Accent 6"/>
     <w:basedOn w:val="TableNormal"/>
     <w:uiPriority w:val="65"/>
-    <w:rsid w:val="00CB0664"/>
     <w:pPr>
       <w:spacing w:after="0" w:line="240" w:lineRule="auto"/>
     </w:pPr>
@@ -17972,7 +17710,6 @@
     <w:name w:val="Medium List 2"/>
     <w:basedOn w:val="TableNormal"/>
     <w:uiPriority w:val="66"/>
-    <w:rsid w:val="00CB0664"/>
     <w:pPr>
       <w:spacing w:after="0" w:line="240" w:lineRule="auto"/>
     </w:pPr>
@@ -18100,7 +17837,6 @@
     <w:name w:val="Medium List 2 Accent 1"/>
     <w:basedOn w:val="TableNormal"/>
     <w:uiPriority w:val="66"/>
-    <w:rsid w:val="00CB0664"/>
     <w:pPr>
       <w:spacing w:after="0" w:line="240" w:lineRule="auto"/>
     </w:pPr>
@@ -18228,7 +17964,6 @@
     <w:name w:val="Medium List 2 Accent 2"/>
     <w:basedOn w:val="TableNormal"/>
     <w:uiPriority w:val="66"/>
-    <w:rsid w:val="00CB0664"/>
     <w:pPr>
       <w:spacing w:after="0" w:line="240" w:lineRule="auto"/>
     </w:pPr>
@@ -18356,7 +18091,6 @@
     <w:name w:val="Medium List 2 Accent 3"/>
     <w:basedOn w:val="TableNormal"/>
     <w:uiPriority w:val="66"/>
-    <w:rsid w:val="00CB0664"/>
     <w:pPr>
       <w:spacing w:after="0" w:line="240" w:lineRule="auto"/>
     </w:pPr>
@@ -18484,7 +18218,6 @@
     <w:name w:val="Medium List 2 Accent 4"/>
     <w:basedOn w:val="TableNormal"/>
     <w:uiPriority w:val="66"/>
-    <w:rsid w:val="00CB0664"/>
     <w:pPr>
       <w:spacing w:after="0" w:line="240" w:lineRule="auto"/>
     </w:pPr>
@@ -18612,7 +18345,6 @@
     <w:name w:val="Medium List 2 Accent 5"/>
     <w:basedOn w:val="TableNormal"/>
     <w:uiPriority w:val="66"/>
-    <w:rsid w:val="00CB0664"/>
     <w:pPr>
       <w:spacing w:after="0" w:line="240" w:lineRule="auto"/>
     </w:pPr>
@@ -18740,7 +18472,6 @@
     <w:name w:val="Medium List 2 Accent 6"/>
     <w:basedOn w:val="TableNormal"/>
     <w:uiPriority w:val="66"/>
-    <w:rsid w:val="00CB0664"/>
     <w:pPr>
       <w:spacing w:after="0" w:line="240" w:lineRule="auto"/>
     </w:pPr>
@@ -18868,7 +18599,6 @@
     <w:name w:val="Medium Grid 1"/>
     <w:basedOn w:val="TableNormal"/>
     <w:uiPriority w:val="67"/>
-    <w:rsid w:val="00CB0664"/>
     <w:pPr>
       <w:spacing w:after="0" w:line="240" w:lineRule="auto"/>
     </w:pPr>
@@ -18941,7 +18671,6 @@
     <w:name w:val="Medium Grid 1 Accent 1"/>
     <w:basedOn w:val="TableNormal"/>
     <w:uiPriority w:val="67"/>
-    <w:rsid w:val="00CB0664"/>
     <w:pPr>
       <w:spacing w:after="0" w:line="240" w:lineRule="auto"/>
     </w:pPr>
@@ -19014,7 +18743,6 @@
     <w:name w:val="Medium Grid 1 Accent 2"/>
     <w:basedOn w:val="TableNormal"/>
     <w:uiPriority w:val="67"/>
-    <w:rsid w:val="00CB0664"/>
     <w:pPr>
       <w:spacing w:after="0" w:line="240" w:lineRule="auto"/>
     </w:pPr>
@@ -19087,7 +18815,6 @@
     <w:name w:val="Medium Grid 1 Accent 3"/>
     <w:basedOn w:val="TableNormal"/>
     <w:uiPriority w:val="67"/>
-    <w:rsid w:val="00CB0664"/>
     <w:pPr>
       <w:spacing w:after="0" w:line="240" w:lineRule="auto"/>
     </w:pPr>
@@ -19160,7 +18887,6 @@
     <w:name w:val="Medium Grid 1 Accent 4"/>
     <w:basedOn w:val="TableNormal"/>
     <w:uiPriority w:val="67"/>
-    <w:rsid w:val="00CB0664"/>
     <w:pPr>
       <w:spacing w:after="0" w:line="240" w:lineRule="auto"/>
     </w:pPr>
@@ -19233,7 +18959,6 @@
     <w:name w:val="Medium Grid 1 Accent 5"/>
     <w:basedOn w:val="TableNormal"/>
     <w:uiPriority w:val="67"/>
-    <w:rsid w:val="00CB0664"/>
     <w:pPr>
       <w:spacing w:after="0" w:line="240" w:lineRule="auto"/>
     </w:pPr>
@@ -19306,7 +19031,6 @@
     <w:name w:val="Medium Grid 1 Accent 6"/>
     <w:basedOn w:val="TableNormal"/>
     <w:uiPriority w:val="67"/>
-    <w:rsid w:val="00CB0664"/>
     <w:pPr>
       <w:spacing w:after="0" w:line="240" w:lineRule="auto"/>
     </w:pPr>
@@ -19379,7 +19103,6 @@
     <w:name w:val="Medium Grid 2"/>
     <w:basedOn w:val="TableNormal"/>
     <w:uiPriority w:val="68"/>
-    <w:rsid w:val="00CB0664"/>
     <w:pPr>
       <w:spacing w:after="0" w:line="240" w:lineRule="auto"/>
     </w:pPr>
@@ -19504,7 +19227,6 @@
     <w:name w:val="Medium Grid 2 Accent 1"/>
     <w:basedOn w:val="TableNormal"/>
     <w:uiPriority w:val="68"/>
-    <w:rsid w:val="00CB0664"/>
     <w:pPr>
       <w:spacing w:after="0" w:line="240" w:lineRule="auto"/>
     </w:pPr>
@@ -19629,7 +19351,6 @@
     <w:name w:val="Medium Grid 2 Accent 2"/>
     <w:basedOn w:val="TableNormal"/>
     <w:uiPriority w:val="68"/>
-    <w:rsid w:val="00CB0664"/>
     <w:pPr>
       <w:spacing w:after="0" w:line="240" w:lineRule="auto"/>
     </w:pPr>
@@ -19754,7 +19475,6 @@
     <w:name w:val="Medium Grid 2 Accent 3"/>
     <w:basedOn w:val="TableNormal"/>
     <w:uiPriority w:val="68"/>
-    <w:rsid w:val="00CB0664"/>
     <w:pPr>
       <w:spacing w:after="0" w:line="240" w:lineRule="auto"/>
     </w:pPr>
@@ -19879,7 +19599,6 @@
     <w:name w:val="Medium Grid 2 Accent 4"/>
     <w:basedOn w:val="TableNormal"/>
     <w:uiPriority w:val="68"/>
-    <w:rsid w:val="00CB0664"/>
     <w:pPr>
       <w:spacing w:after="0" w:line="240" w:lineRule="auto"/>
     </w:pPr>
@@ -20004,7 +19723,6 @@
     <w:name w:val="Medium Grid 2 Accent 5"/>
     <w:basedOn w:val="TableNormal"/>
     <w:uiPriority w:val="68"/>
-    <w:rsid w:val="00CB0664"/>
     <w:pPr>
       <w:spacing w:after="0" w:line="240" w:lineRule="auto"/>
     </w:pPr>
@@ -20129,7 +19847,6 @@
     <w:name w:val="Medium Grid 2 Accent 6"/>
     <w:basedOn w:val="TableNormal"/>
     <w:uiPriority w:val="68"/>
-    <w:rsid w:val="00CB0664"/>
     <w:pPr>
       <w:spacing w:after="0" w:line="240" w:lineRule="auto"/>
     </w:pPr>
@@ -20254,7 +19971,6 @@
     <w:name w:val="Medium Grid 3"/>
     <w:basedOn w:val="TableNormal"/>
     <w:uiPriority w:val="69"/>
-    <w:rsid w:val="00CB0664"/>
     <w:pPr>
       <w:spacing w:after="0" w:line="240" w:lineRule="auto"/>
     </w:pPr>
@@ -20395,7 +20111,6 @@
     <w:name w:val="Medium Grid 3 Accent 1"/>
     <w:basedOn w:val="TableNormal"/>
     <w:uiPriority w:val="69"/>
-    <w:rsid w:val="00CB0664"/>
     <w:pPr>
       <w:spacing w:after="0" w:line="240" w:lineRule="auto"/>
     </w:pPr>
@@ -20536,7 +20251,6 @@
     <w:name w:val="Medium Grid 3 Accent 2"/>
     <w:basedOn w:val="TableNormal"/>
     <w:uiPriority w:val="69"/>
-    <w:rsid w:val="00CB0664"/>
     <w:pPr>
       <w:spacing w:after="0" w:line="240" w:lineRule="auto"/>
     </w:pPr>
@@ -20677,7 +20391,6 @@
     <w:name w:val="Medium Grid 3 Accent 3"/>
     <w:basedOn w:val="TableNormal"/>
     <w:uiPriority w:val="69"/>
-    <w:rsid w:val="00CB0664"/>
     <w:pPr>
       <w:spacing w:after="0" w:line="240" w:lineRule="auto"/>
     </w:pPr>
@@ -20818,7 +20531,6 @@
     <w:name w:val="Medium Grid 3 Accent 4"/>
     <w:basedOn w:val="TableNormal"/>
     <w:uiPriority w:val="69"/>
-    <w:rsid w:val="00CB0664"/>
     <w:pPr>
       <w:spacing w:after="0" w:line="240" w:lineRule="auto"/>
     </w:pPr>
@@ -20959,7 +20671,6 @@
     <w:name w:val="Medium Grid 3 Accent 5"/>
     <w:basedOn w:val="TableNormal"/>
     <w:uiPriority w:val="69"/>
-    <w:rsid w:val="00CB0664"/>
     <w:pPr>
       <w:spacing w:after="0" w:line="240" w:lineRule="auto"/>
     </w:pPr>
@@ -21100,7 +20811,6 @@
     <w:name w:val="Medium Grid 3 Accent 6"/>
     <w:basedOn w:val="TableNormal"/>
     <w:uiPriority w:val="69"/>
-    <w:rsid w:val="00CB0664"/>
     <w:pPr>
       <w:spacing w:after="0" w:line="240" w:lineRule="auto"/>
     </w:pPr>
@@ -21241,7 +20951,6 @@
     <w:name w:val="Dark List"/>
     <w:basedOn w:val="TableNormal"/>
     <w:uiPriority w:val="70"/>
-    <w:rsid w:val="00CB0664"/>
     <w:pPr>
       <w:spacing w:after="0" w:line="240" w:lineRule="auto"/>
     </w:pPr>
@@ -21355,7 +21064,6 @@
     <w:name w:val="Dark List Accent 1"/>
     <w:basedOn w:val="TableNormal"/>
     <w:uiPriority w:val="70"/>
-    <w:rsid w:val="00CB0664"/>
     <w:pPr>
       <w:spacing w:after="0" w:line="240" w:lineRule="auto"/>
     </w:pPr>
@@ -21469,7 +21177,6 @@
     <w:name w:val="Dark List Accent 2"/>
     <w:basedOn w:val="TableNormal"/>
     <w:uiPriority w:val="70"/>
-    <w:rsid w:val="00CB0664"/>
     <w:pPr>
       <w:spacing w:after="0" w:line="240" w:lineRule="auto"/>
     </w:pPr>
@@ -21583,7 +21290,6 @@
     <w:name w:val="Dark List Accent 3"/>
     <w:basedOn w:val="TableNormal"/>
     <w:uiPriority w:val="70"/>
-    <w:rsid w:val="00CB0664"/>
     <w:pPr>
       <w:spacing w:after="0" w:line="240" w:lineRule="auto"/>
     </w:pPr>
@@ -21697,7 +21403,6 @@
     <w:name w:val="Dark List Accent 4"/>
     <w:basedOn w:val="TableNormal"/>
     <w:uiPriority w:val="70"/>
-    <w:rsid w:val="00CB0664"/>
     <w:pPr>
       <w:spacing w:after="0" w:line="240" w:lineRule="auto"/>
     </w:pPr>
@@ -21811,7 +21516,6 @@
     <w:name w:val="Dark List Accent 5"/>
     <w:basedOn w:val="TableNormal"/>
     <w:uiPriority w:val="70"/>
-    <w:rsid w:val="00CB0664"/>
     <w:pPr>
       <w:spacing w:after="0" w:line="240" w:lineRule="auto"/>
     </w:pPr>
@@ -21925,7 +21629,6 @@
     <w:name w:val="Dark List Accent 6"/>
     <w:basedOn w:val="TableNormal"/>
     <w:uiPriority w:val="70"/>
-    <w:rsid w:val="00CB0664"/>
     <w:pPr>
       <w:spacing w:after="0" w:line="240" w:lineRule="auto"/>
     </w:pPr>
@@ -22039,7 +21742,6 @@
     <w:name w:val="Colorful Shading"/>
     <w:basedOn w:val="TableNormal"/>
     <w:uiPriority w:val="71"/>
-    <w:rsid w:val="00CB0664"/>
     <w:pPr>
       <w:spacing w:after="0" w:line="240" w:lineRule="auto"/>
     </w:pPr>
@@ -22161,7 +21863,6 @@
     <w:name w:val="Colorful Shading Accent 1"/>
     <w:basedOn w:val="TableNormal"/>
     <w:uiPriority w:val="71"/>
-    <w:rsid w:val="00CB0664"/>
     <w:pPr>
       <w:spacing w:after="0" w:line="240" w:lineRule="auto"/>
     </w:pPr>
@@ -22283,7 +21984,6 @@
     <w:name w:val="Colorful Shading Accent 2"/>
     <w:basedOn w:val="TableNormal"/>
     <w:uiPriority w:val="71"/>
-    <w:rsid w:val="00CB0664"/>
     <w:pPr>
       <w:spacing w:after="0" w:line="240" w:lineRule="auto"/>
     </w:pPr>
@@ -22405,7 +22105,6 @@
     <w:name w:val="Colorful Shading Accent 3"/>
     <w:basedOn w:val="TableNormal"/>
     <w:uiPriority w:val="71"/>
-    <w:rsid w:val="00CB0664"/>
     <w:pPr>
       <w:spacing w:after="0" w:line="240" w:lineRule="auto"/>
     </w:pPr>
@@ -22517,7 +22216,6 @@
     <w:name w:val="Colorful Shading Accent 4"/>
     <w:basedOn w:val="TableNormal"/>
     <w:uiPriority w:val="71"/>
-    <w:rsid w:val="00CB0664"/>
     <w:pPr>
       <w:spacing w:after="0" w:line="240" w:lineRule="auto"/>
     </w:pPr>
@@ -22639,7 +22337,6 @@
     <w:name w:val="Colorful Shading Accent 5"/>
     <w:basedOn w:val="TableNormal"/>
     <w:uiPriority w:val="71"/>
-    <w:rsid w:val="00CB0664"/>
     <w:pPr>
       <w:spacing w:after="0" w:line="240" w:lineRule="auto"/>
     </w:pPr>
@@ -22761,7 +22458,6 @@
     <w:name w:val="Colorful Shading Accent 6"/>
     <w:basedOn w:val="TableNormal"/>
     <w:uiPriority w:val="71"/>
-    <w:rsid w:val="00CB0664"/>
     <w:pPr>
       <w:spacing w:after="0" w:line="240" w:lineRule="auto"/>
     </w:pPr>
@@ -22883,7 +22579,6 @@
     <w:name w:val="Colorful List"/>
     <w:basedOn w:val="TableNormal"/>
     <w:uiPriority w:val="72"/>
-    <w:rsid w:val="00CB0664"/>
     <w:pPr>
       <w:spacing w:after="0" w:line="240" w:lineRule="auto"/>
     </w:pPr>
@@ -22969,7 +22664,6 @@
     <w:name w:val="Colorful List Accent 1"/>
     <w:basedOn w:val="TableNormal"/>
     <w:uiPriority w:val="72"/>
-    <w:rsid w:val="00CB0664"/>
     <w:pPr>
       <w:spacing w:after="0" w:line="240" w:lineRule="auto"/>
     </w:pPr>
@@ -23055,7 +22749,6 @@
     <w:name w:val="Colorful List Accent 2"/>
     <w:basedOn w:val="TableNormal"/>
     <w:uiPriority w:val="72"/>
-    <w:rsid w:val="00CB0664"/>
     <w:pPr>
       <w:spacing w:after="0" w:line="240" w:lineRule="auto"/>
     </w:pPr>
@@ -23141,7 +22834,6 @@
     <w:name w:val="Colorful List Accent 3"/>
     <w:basedOn w:val="TableNormal"/>
     <w:uiPriority w:val="72"/>
-    <w:rsid w:val="00CB0664"/>
     <w:pPr>
       <w:spacing w:after="0" w:line="240" w:lineRule="auto"/>
     </w:pPr>
@@ -23227,7 +22919,6 @@
     <w:name w:val="Colorful List Accent 4"/>
     <w:basedOn w:val="TableNormal"/>
     <w:uiPriority w:val="72"/>
-    <w:rsid w:val="00CB0664"/>
     <w:pPr>
       <w:spacing w:after="0" w:line="240" w:lineRule="auto"/>
     </w:pPr>
@@ -23313,7 +23004,6 @@
     <w:name w:val="Colorful List Accent 5"/>
     <w:basedOn w:val="TableNormal"/>
     <w:uiPriority w:val="72"/>
-    <w:rsid w:val="00CB0664"/>
     <w:pPr>
       <w:spacing w:after="0" w:line="240" w:lineRule="auto"/>
     </w:pPr>
@@ -23399,7 +23089,6 @@
     <w:name w:val="Colorful List Accent 6"/>
     <w:basedOn w:val="TableNormal"/>
     <w:uiPriority w:val="72"/>
-    <w:rsid w:val="00CB0664"/>
     <w:pPr>
       <w:spacing w:after="0" w:line="240" w:lineRule="auto"/>
     </w:pPr>
@@ -23485,7 +23174,6 @@
     <w:name w:val="Colorful Grid"/>
     <w:basedOn w:val="TableNormal"/>
     <w:uiPriority w:val="73"/>
-    <w:rsid w:val="00CB0664"/>
     <w:pPr>
       <w:spacing w:after="0" w:line="240" w:lineRule="auto"/>
     </w:pPr>
@@ -23565,7 +23253,6 @@
     <w:name w:val="Colorful Grid Accent 1"/>
     <w:basedOn w:val="TableNormal"/>
     <w:uiPriority w:val="73"/>
-    <w:rsid w:val="00CB0664"/>
     <w:pPr>
       <w:spacing w:after="0" w:line="240" w:lineRule="auto"/>
     </w:pPr>
@@ -23645,7 +23332,6 @@
     <w:name w:val="Colorful Grid Accent 2"/>
     <w:basedOn w:val="TableNormal"/>
     <w:uiPriority w:val="73"/>
-    <w:rsid w:val="00CB0664"/>
     <w:pPr>
       <w:spacing w:after="0" w:line="240" w:lineRule="auto"/>
     </w:pPr>
@@ -23725,7 +23411,6 @@
     <w:name w:val="Colorful Grid Accent 3"/>
     <w:basedOn w:val="TableNormal"/>
     <w:uiPriority w:val="73"/>
-    <w:rsid w:val="00CB0664"/>
     <w:pPr>
       <w:spacing w:after="0" w:line="240" w:lineRule="auto"/>
     </w:pPr>
@@ -23805,7 +23490,6 @@
     <w:name w:val="Colorful Grid Accent 4"/>
     <w:basedOn w:val="TableNormal"/>
     <w:uiPriority w:val="73"/>
-    <w:rsid w:val="00CB0664"/>
     <w:pPr>
       <w:spacing w:after="0" w:line="240" w:lineRule="auto"/>
     </w:pPr>
@@ -23885,7 +23569,6 @@
     <w:name w:val="Colorful Grid Accent 5"/>
     <w:basedOn w:val="TableNormal"/>
     <w:uiPriority w:val="73"/>
-    <w:rsid w:val="00CB0664"/>
     <w:pPr>
       <w:spacing w:after="0" w:line="240" w:lineRule="auto"/>
     </w:pPr>
@@ -23965,7 +23648,6 @@
     <w:name w:val="Colorful Grid Accent 6"/>
     <w:basedOn w:val="TableNormal"/>
     <w:uiPriority w:val="73"/>
-    <w:rsid w:val="00CB0664"/>
     <w:pPr>
       <w:spacing w:after="0" w:line="240" w:lineRule="auto"/>
     </w:pPr>

</xml_diff>